<commit_message>
Rewrite supervisor report in plain human language
Full prose rewrite after researcher feedback: short sentences, we
voice, every enumeration moved to its own line (in body text and inside
table cells via multi-paragraph cells), each block answers why in
plain words. Agreed 3-section structure unchanged.

Co-Authored-By: Claude Fable 5 <noreply@anthropic.com>
</commit_message>
<xml_diff>
--- a/reports/Otchet_o_prodelannoy_rabote.docx
+++ b/reports/Otchet_o_prodelannoy_rabote.docx
@@ -5,7 +5,6 @@
     <w:p>
       <w:pPr>
         <w:spacing w:after="1200"/>
-        <w:ind w:firstLine="0"/>
       </w:pPr>
       <w:r>
         <w:rPr>
@@ -17,7 +16,6 @@
     <w:p>
       <w:pPr>
         <w:spacing w:after="120"/>
-        <w:ind w:firstLine="0"/>
         <w:jc w:val="center"/>
       </w:pPr>
       <w:r>
@@ -31,7 +29,6 @@
     <w:p>
       <w:pPr>
         <w:spacing w:after="480"/>
-        <w:ind w:firstLine="0"/>
         <w:jc w:val="center"/>
       </w:pPr>
       <w:r>
@@ -45,7 +42,6 @@
     <w:p>
       <w:pPr>
         <w:spacing w:after="240"/>
-        <w:ind w:firstLine="0"/>
         <w:jc w:val="center"/>
       </w:pPr>
       <w:r>
@@ -59,7 +55,6 @@
     <w:p>
       <w:pPr>
         <w:spacing w:after="4000"/>
-        <w:ind w:firstLine="0"/>
         <w:jc w:val="center"/>
       </w:pPr>
       <w:r>
@@ -73,7 +68,6 @@
     <w:p>
       <w:pPr>
         <w:spacing w:after="120"/>
-        <w:ind w:firstLine="0"/>
         <w:jc w:val="center"/>
       </w:pPr>
       <w:r>
@@ -100,14 +94,52 @@
     <w:p>
       <w:pPr>
         <w:spacing w:after="120"/>
-        <w:ind w:firstLine="0"/>
       </w:pPr>
       <w:r>
         <w:rPr>
           <w:b w:val="0"/>
           <w:i w:val="0"/>
         </w:rPr>
-        <w:t>Настоящий отчёт подводит промежуточный итог работы над исследовательским проектом, выполняемым в рамках утверждённой формулировки задачи исследования. За отчётный период выстроены три опоры проекта: (1) содержательная концепция исследуемого индекса инфляционного импульса, реализующая утверждённую задачу; (2) корпус региональных данных, собранный из официальных и открытых источников и приведённый к единому формату; (3) программная лаборатория, обеспечивающая воспроизводимость всех расчётов. Отчёт состоит из трёх разделов, соответствующих этим опорам.</w:t>
+        <w:t>Мы изучаем, как рост цен на продукты перетекает из одних регионов России в другие. За отчётный период сделаны три больших блока работы:</w:t>
+      </w:r>
+    </w:p>
+    <w:p>
+      <w:pPr>
+        <w:pStyle w:val="ListBullet"/>
+        <w:spacing w:after="60"/>
+      </w:pPr>
+      <w:r>
+        <w:t>продумана и обоснована концепция индекса инфляционного импульса;</w:t>
+      </w:r>
+    </w:p>
+    <w:p>
+      <w:pPr>
+        <w:pStyle w:val="ListBullet"/>
+        <w:spacing w:after="60"/>
+      </w:pPr>
+      <w:r>
+        <w:t>собран большой массив данных по всем регионам страны;</w:t>
+      </w:r>
+    </w:p>
+    <w:p>
+      <w:pPr>
+        <w:pStyle w:val="ListBullet"/>
+        <w:spacing w:after="60"/>
+      </w:pPr>
+      <w:r>
+        <w:t>построена программная лаборатория, в которой идут все расчёты.</w:t>
+      </w:r>
+    </w:p>
+    <w:p>
+      <w:pPr>
+        <w:spacing w:after="120"/>
+      </w:pPr>
+      <w:r>
+        <w:rPr>
+          <w:b w:val="0"/>
+          <w:i w:val="0"/>
+        </w:rPr>
+        <w:t>Ниже подробно о каждом блоке.</w:t>
       </w:r>
     </w:p>
     <w:p>
@@ -123,33 +155,31 @@
         <w:pStyle w:val="Heading2"/>
       </w:pPr>
       <w:r>
-        <w:t>1.1. Утверждённая задача исследования</w:t>
+        <w:t>1.1. Какую задачу мы решаем</w:t>
       </w:r>
     </w:p>
     <w:p>
       <w:pPr>
         <w:spacing w:after="120"/>
-        <w:ind w:firstLine="0"/>
       </w:pPr>
       <w:r>
         <w:rPr>
           <w:b w:val="0"/>
           <w:i w:val="0"/>
         </w:rPr>
-        <w:t>Исследование выполняется строго в рамках утверждённой формулировки задачи. Цель — разработать и эмпирически проверить модель межрегионального распространения продовольственной инфляции в России: установить наличие, силу, направление и лаги передачи ценовых шоков между субъектами РФ, определить регионы-источники, регионы-получатели и основные каналы распространения.</w:t>
+        <w:t>Когда в одном регионе дорожает еда, через некоторое время она часто дорожает и у соседей. Наш проект проверяет, случайность это или закономерность. Утверждённая формулировка задачи ставит цель так: построить и проверить на данных модель распространения продовольственной инфляции между субъектами РФ.</w:t>
       </w:r>
     </w:p>
     <w:p>
       <w:pPr>
         <w:spacing w:after="120"/>
-        <w:ind w:firstLine="0"/>
       </w:pPr>
       <w:r>
         <w:rPr>
           <w:b w:val="0"/>
           <w:i w:val="0"/>
         </w:rPr>
-        <w:t>Основная гипотеза: ускорение продовольственной инфляции в регионе или группе связанных регионов приводит к последующему ускорению продовольственной инфляции в других регионах, причём сила и скорость передачи зависят от характера межрегиональных связей. Дополнительные гипотезы уточняют её:</w:t>
+        <w:t>Простыми словами, мы ищем ответы на четыре вопроса:</w:t>
       </w:r>
     </w:p>
     <w:p>
@@ -158,7 +188,7 @@
         <w:spacing w:after="60"/>
       </w:pPr>
       <w:r>
-        <w:t>H1 — передача сильнее между территориально близкими и граничащими регионами;</w:t>
+        <w:t>Правда ли, что после роста цен у соседей цены растут и в самом регионе?</w:t>
       </w:r>
     </w:p>
     <w:p>
@@ -167,7 +197,7 @@
         <w:spacing w:after="60"/>
       </w:pPr>
       <w:r>
-        <w:t>H2 — помимо соседства, роль играют общий федеральный округ, транспортная и экономическая связанность;</w:t>
+        <w:t>Через сколько месяцев докатывается такая «волна»?</w:t>
       </w:r>
     </w:p>
     <w:p>
@@ -176,7 +206,7 @@
         <w:spacing w:after="60"/>
       </w:pPr>
       <w:r>
-        <w:t>H3 — сила передачи различается по товарным группам: для сезонных и логистически чувствительных товаров эффект выраженнее;</w:t>
+        <w:t>По каким связям она идёт сильнее: общая граница, расстояние, федеральный округ или транспортные пути?</w:t>
       </w:r>
     </w:p>
     <w:p>
@@ -185,83 +215,19 @@
         <w:spacing w:after="60"/>
       </w:pPr>
       <w:r>
-        <w:t>H4 — межрегиональный эффект должен сохраняться после учёта общероссийских макроэкономических шоков и внутренних региональных факторов.</w:t>
+        <w:t>Какие регионы запускают волны, а какие в основном принимают чужие?</w:t>
       </w:r>
     </w:p>
     <w:p>
       <w:pPr>
         <w:spacing w:after="120"/>
-        <w:ind w:firstLine="0"/>
       </w:pPr>
       <w:r>
         <w:rPr>
           <w:b w:val="0"/>
           <w:i w:val="0"/>
         </w:rPr>
-        <w:t>Границы: основной период 2015–2025 гг., месячная частота, единица наблюдения — субъект РФ в конкретном месяце, основной показатель — региональная продовольственная инфляция.</w:t>
-      </w:r>
-    </w:p>
-    <w:p>
-      <w:pPr>
-        <w:pStyle w:val="Heading2"/>
-      </w:pPr>
-      <w:r>
-        <w:t>1.2. Трёхслойная архитектура индекса</w:t>
-      </w:r>
-    </w:p>
-    <w:p>
-      <w:pPr>
-        <w:spacing w:after="120"/>
-        <w:ind w:firstLine="0"/>
-      </w:pPr>
-      <w:r>
-        <w:rPr>
-          <w:b w:val="0"/>
-          <w:i w:val="0"/>
-        </w:rPr>
-        <w:t>Рабочая конструкция исследования — индекс инфляционного импульса, собираемый из трёх смысловых слоёв: тело, транспорт и среда. Каждый слой отвечает на один из вопросов утверждённой задачи: что распространяется, по каким каналам и почему регионы по-разному это принимают.</w:t>
-      </w:r>
-    </w:p>
-    <w:p>
-      <w:pPr>
-        <w:pStyle w:val="Heading3"/>
-      </w:pPr>
-      <w:r>
-        <w:t>Тело: что распространяется</w:t>
-      </w:r>
-    </w:p>
-    <w:p>
-      <w:pPr>
-        <w:spacing w:after="120"/>
-        <w:ind w:firstLine="0"/>
-      </w:pPr>
-      <w:r>
-        <w:rPr>
-          <w:b w:val="0"/>
-          <w:i w:val="0"/>
-        </w:rPr>
-        <w:t>Тело импульса — сами ценовые сигналы: региональная продовольственная инфляция и её товарные составляющие (продовольственные группы, отдельные товары, топливо как элемент издержек, алкогольная группа). Обоснование выбора: месячные индексы потребительских цен Росстата — единственный источник, дающий сопоставимые между всеми субъектами РФ месячные ряды за весь период исследования; товарная детализация тела прямо обслуживает гипотезу H3 — сравнение передачи по товарам с разной сезонностью, логистической чувствительностью и структурой потребления.</w:t>
-      </w:r>
-    </w:p>
-    <w:p>
-      <w:pPr>
-        <w:pStyle w:val="Heading3"/>
-      </w:pPr>
-      <w:r>
-        <w:t>Транспорт: по каким каналам</w:t>
-      </w:r>
-    </w:p>
-    <w:p>
-      <w:pPr>
-        <w:spacing w:after="120"/>
-        <w:ind w:firstLine="0"/>
-      </w:pPr>
-      <w:r>
-        <w:rPr>
-          <w:b w:val="0"/>
-          <w:i w:val="0"/>
-        </w:rPr>
-        <w:t>Транспортный слой формализует межрегиональные связи матрицей W: элемент W[j, r] задаёт силу связи региона-источника j с регионом-получателем r. Транспортированный импульс вычисляется как взвешенная сумма лагированных сигналов связанных регионов: incoming[r, t] = Σ W[j, r] × impulse[j, t − lag]. Ключевое исследовательское решение — сравнение НЕСКОЛЬКИХ вариантов матрицы связей, отвечающее на вопрос о главном канале распространения (RQ3 и гипотезы H1–H2):</w:t>
+        <w:t>У задачи есть четыре гипотезы:</w:t>
       </w:r>
     </w:p>
     <w:p>
@@ -270,7 +236,7 @@
         <w:spacing w:after="60"/>
       </w:pPr>
       <w:r>
-        <w:t>общая граница (соседство) — физическая смежность рынков;</w:t>
+        <w:t>H1. Передача сильнее между соседними, граничащими регионами.</w:t>
       </w:r>
     </w:p>
     <w:p>
@@ -279,7 +245,7 @@
         <w:spacing w:after="60"/>
       </w:pPr>
       <w:r>
-        <w:t>обратное расстояние между административными центрами — затухание с дистанцией;</w:t>
+        <w:t>H2. Кроме соседства работают федеральный округ и транспортная связанность.</w:t>
       </w:r>
     </w:p>
     <w:p>
@@ -288,7 +254,7 @@
         <w:spacing w:after="60"/>
       </w:pPr>
       <w:r>
-        <w:t>общий федеральный округ — административно-логистическая общность;</w:t>
+        <w:t>H3. По разным товарам передача разная: сезонные и «капризные» к перевозке товары передают шок сильнее.</w:t>
       </w:r>
     </w:p>
     <w:p>
@@ -297,7 +263,19 @@
         <w:spacing w:after="60"/>
       </w:pPr>
       <w:r>
-        <w:t>железнодорожный слой: узловые веса по вокзалам и матрица прямых магистралей — реальная логистика перевозок;</w:t>
+        <w:t>H4. Эффект должен оставаться даже после того, как мы уберём влияние общероссийских событий и постоянных особенностей каждого региона.</w:t>
+      </w:r>
+    </w:p>
+    <w:p>
+      <w:pPr>
+        <w:spacing w:after="120"/>
+      </w:pPr>
+      <w:r>
+        <w:rPr>
+          <w:b w:val="0"/>
+          <w:i w:val="0"/>
+        </w:rPr>
+        <w:t>Рамки исследования:</w:t>
       </w:r>
     </w:p>
     <w:p>
@@ -306,41 +284,7 @@
         <w:spacing w:after="60"/>
       </w:pPr>
       <w:r>
-        <w:t>автодорожный слой: пропускная способность границ по числу полос федеральных трасс (в сборке).</w:t>
-      </w:r>
-    </w:p>
-    <w:p>
-      <w:pPr>
-        <w:spacing w:after="120"/>
-        <w:ind w:firstLine="0"/>
-      </w:pPr>
-      <w:r>
-        <w:rPr>
-          <w:b w:val="0"/>
-          <w:i w:val="0"/>
-        </w:rPr>
-        <w:t>Обоснование: продовольствие физически перемещается по транспортной сети, поэтому географические и инфраструктурные матрицы — естественные кандидаты канала передачи; их сопоставление позволяет отличить простую пространственную корреляцию от передачи по конкретной инфраструктуре.</w:t>
-      </w:r>
-    </w:p>
-    <w:p>
-      <w:pPr>
-        <w:pStyle w:val="Heading3"/>
-      </w:pPr>
-      <w:r>
-        <w:t>Среда: почему регионы принимают импульс по-разному</w:t>
-      </w:r>
-    </w:p>
-    <w:p>
-      <w:pPr>
-        <w:spacing w:after="120"/>
-        <w:ind w:firstLine="0"/>
-      </w:pPr>
-      <w:r>
-        <w:rPr>
-          <w:b w:val="0"/>
-          <w:i w:val="0"/>
-        </w:rPr>
-        <w:t>Средовый слой описывает восприимчивость региона к входящему импульсу. Один и тот же внешний шок в разных регионах даёт разный ценовой отклик — в зависимости от собственной продовольственной базы, структуры спроса и издержек. В модель среда входит через взаимодействия с транспортированным импульсом, что позволяет оценивать, какие характеристики усиливают или гасят передачу. Собранные средовые слои:</w:t>
+        <w:t>период — 2015–2025 годы;</w:t>
       </w:r>
     </w:p>
     <w:p>
@@ -349,7 +293,7 @@
         <w:spacing w:after="60"/>
       </w:pPr>
       <w:r>
-        <w:t>собственная пищевая база: продукция сельского хозяйства, индекс производства пищевых продуктов — потенциальный буфер или, напротив, индикатор включённости в межрегиональную торговлю;</w:t>
+        <w:t>шаг — один месяц;</w:t>
       </w:r>
     </w:p>
     <w:p>
@@ -358,7 +302,7 @@
         <w:spacing w:after="60"/>
       </w:pPr>
       <w:r>
-        <w:t>доходы, заработная плата, безработица — платёжеспособность и эластичность спроса;</w:t>
+        <w:t>единица наблюдения — субъект РФ;</w:t>
       </w:r>
     </w:p>
     <w:p>
@@ -367,7 +311,47 @@
         <w:spacing w:after="60"/>
       </w:pPr>
       <w:r>
-        <w:t>половозрастная структура — доля старших возрастов как индикатор неэластичного спроса при фиксированных доходах;</w:t>
+        <w:t>главный показатель — продовольственная инфляция региона.</w:t>
+      </w:r>
+    </w:p>
+    <w:p>
+      <w:pPr>
+        <w:pStyle w:val="Heading2"/>
+      </w:pPr>
+      <w:r>
+        <w:t>1.2. Из чего собирается индекс</w:t>
+      </w:r>
+    </w:p>
+    <w:p>
+      <w:pPr>
+        <w:spacing w:after="120"/>
+      </w:pPr>
+      <w:r>
+        <w:rPr>
+          <w:b w:val="0"/>
+          <w:i w:val="0"/>
+        </w:rPr>
+        <w:t>Чтобы описать распространение, нужно знать три вещи: ЧТО распространяется, ПО КАКИМ ПУТЯМ оно движется и КТО КАК его принимает. Отсюда три слоя индекса.</w:t>
+      </w:r>
+    </w:p>
+    <w:p>
+      <w:pPr>
+        <w:pStyle w:val="Heading3"/>
+      </w:pPr>
+      <w:r>
+        <w:t>Тело — что распространяется</w:t>
+      </w:r>
+    </w:p>
+    <w:p>
+      <w:pPr>
+        <w:spacing w:after="120"/>
+      </w:pPr>
+      <w:r>
+        <w:rPr>
+          <w:b w:val="0"/>
+          <w:i w:val="0"/>
+        </w:rPr>
+        <w:t>Тело — это сами ценовые сигналы. У нас это:</w:t>
       </w:r>
     </w:p>
     <w:p>
@@ -376,7 +360,7 @@
         <w:spacing w:after="60"/>
       </w:pPr>
       <w:r>
-        <w:t>этнокультурная структура потребления (по переписи) — различия продовольственной корзины, дающие дифференциальные предсказания по товарам (H3);</w:t>
+        <w:t>продовольственная инфляция каждого региона (главный ряд);</w:t>
       </w:r>
     </w:p>
     <w:p>
@@ -385,7 +369,7 @@
         <w:spacing w:after="60"/>
       </w:pPr>
       <w:r>
-        <w:t>тарифы ЖКХ — издержковый канал торговли и хранения; их административная индексация делает динамику квазиэкзогенной;</w:t>
+        <w:t>инфляция по товарным группам: продукты без алкоголя, без овощей и фруктов и другие;</w:t>
       </w:r>
     </w:p>
     <w:p>
@@ -394,7 +378,7 @@
         <w:spacing w:after="60"/>
       </w:pPr>
       <w:r>
-        <w:t>туристическая инфраструктура — приезжий спрос как усилитель зависимости от ввоза;</w:t>
+        <w:t>отдельные товары: свинина, говядина, баранина, мясо птицы, алкоголь, водка;</w:t>
       </w:r>
     </w:p>
     <w:p>
@@ -403,7 +387,203 @@
         <w:spacing w:after="60"/>
       </w:pPr>
       <w:r>
-        <w:t>климат: температурные аномалии — экзогенные шоки предложения, редкая возможность приблизиться к причинной идентификации канала передачи.</w:t>
+        <w:t>топливо (бензин, дизель) — это издержки перевозки продуктов.</w:t>
+      </w:r>
+    </w:p>
+    <w:p>
+      <w:pPr>
+        <w:spacing w:after="120"/>
+      </w:pPr>
+      <w:r>
+        <w:rPr>
+          <w:b w:val="0"/>
+          <w:i w:val="0"/>
+        </w:rPr>
+        <w:t>Почему именно так. Индексы цен Росстата — единственный источник, который даёт сравнимые месячные ряды по всем 85 регионам за все годы исследования. А раскладка по товарам нужна для гипотезы H3: мы сможем сравнить, как передаётся шок по разным товарам.</w:t>
+      </w:r>
+    </w:p>
+    <w:p>
+      <w:pPr>
+        <w:pStyle w:val="Heading3"/>
+      </w:pPr>
+      <w:r>
+        <w:t>Транспорт — по каким путям</w:t>
+      </w:r>
+    </w:p>
+    <w:p>
+      <w:pPr>
+        <w:spacing w:after="120"/>
+      </w:pPr>
+      <w:r>
+        <w:rPr>
+          <w:b w:val="0"/>
+          <w:i w:val="0"/>
+        </w:rPr>
+        <w:t>Этот слой отвечает на вопрос «кто с кем связан и насколько сильно». Связи записываются в таблицу-матрицу: для каждой пары регионов — сила их связи. Дальше работает простая идея: входящий импульс региона равен сумме прошлых шоков его соседей, взвешенных на силу связи с каждым из них.</w:t>
+      </w:r>
+    </w:p>
+    <w:p>
+      <w:pPr>
+        <w:spacing w:after="120"/>
+      </w:pPr>
+      <w:r>
+        <w:rPr>
+          <w:b w:val="0"/>
+          <w:i w:val="0"/>
+        </w:rPr>
+        <w:t>Самое интересное — вариантов «карты связей» несколько, и мы их сравниваем между собой:</w:t>
+      </w:r>
+    </w:p>
+    <w:p>
+      <w:pPr>
+        <w:pStyle w:val="ListBullet"/>
+        <w:spacing w:after="60"/>
+      </w:pPr>
+      <w:r>
+        <w:t>общая граница — соседи по карте;</w:t>
+      </w:r>
+    </w:p>
+    <w:p>
+      <w:pPr>
+        <w:pStyle w:val="ListBullet"/>
+        <w:spacing w:after="60"/>
+      </w:pPr>
+      <w:r>
+        <w:t>расстояние между столицами регионов — чем ближе, тем сильнее связь;</w:t>
+      </w:r>
+    </w:p>
+    <w:p>
+      <w:pPr>
+        <w:pStyle w:val="ListBullet"/>
+        <w:spacing w:after="60"/>
+      </w:pPr>
+      <w:r>
+        <w:t>общий федеральный округ — единая административная и логистическая зона;</w:t>
+      </w:r>
+    </w:p>
+    <w:p>
+      <w:pPr>
+        <w:pStyle w:val="ListBullet"/>
+        <w:spacing w:after="60"/>
+      </w:pPr>
+      <w:r>
+        <w:t>железная дорога — вокзалы и прямые магистрали между регионами;</w:t>
+      </w:r>
+    </w:p>
+    <w:p>
+      <w:pPr>
+        <w:pStyle w:val="ListBullet"/>
+        <w:spacing w:after="60"/>
+      </w:pPr>
+      <w:r>
+        <w:t>автодороги — сколько полос федеральных трасс пересекает общую границу (сейчас досчитывается).</w:t>
+      </w:r>
+    </w:p>
+    <w:p>
+      <w:pPr>
+        <w:spacing w:after="120"/>
+      </w:pPr>
+      <w:r>
+        <w:rPr>
+          <w:b w:val="0"/>
+          <w:i w:val="0"/>
+        </w:rPr>
+        <w:t>Зачем сравнивать. Продукты возят по конкретным дорогам и рельсам. Если передача цен идёт именно по инфраструктуре, а не просто «где-то рядом», мы это увидим — и ответим на вопрос о главном канале распространения.</w:t>
+      </w:r>
+    </w:p>
+    <w:p>
+      <w:pPr>
+        <w:pStyle w:val="Heading3"/>
+      </w:pPr>
+      <w:r>
+        <w:t>Среда — кто как принимает</w:t>
+      </w:r>
+    </w:p>
+    <w:p>
+      <w:pPr>
+        <w:spacing w:after="120"/>
+      </w:pPr>
+      <w:r>
+        <w:rPr>
+          <w:b w:val="0"/>
+          <w:i w:val="0"/>
+        </w:rPr>
+        <w:t>Один и тот же шок в разных регионах даёт разный эффект. Слой среды описывает, почему так происходит. Мы собрали характеристики, каждая из которых может усиливать или гасить входящую волну:</w:t>
+      </w:r>
+    </w:p>
+    <w:p>
+      <w:pPr>
+        <w:pStyle w:val="ListBullet"/>
+        <w:spacing w:after="60"/>
+      </w:pPr>
+      <w:r>
+        <w:t>своё сельское хозяйство и пищевая промышленность — регион с собственной едой может иначе реагировать на чужие шоки;</w:t>
+      </w:r>
+    </w:p>
+    <w:p>
+      <w:pPr>
+        <w:pStyle w:val="ListBullet"/>
+        <w:spacing w:after="60"/>
+      </w:pPr>
+      <w:r>
+        <w:t>доходы, зарплаты и безработица — сколько люди могут платить;</w:t>
+      </w:r>
+    </w:p>
+    <w:p>
+      <w:pPr>
+        <w:pStyle w:val="ListBullet"/>
+        <w:spacing w:after="60"/>
+      </w:pPr>
+      <w:r>
+        <w:t>возрастной состав — там, где больше пожилых, спрос на базовые продукты менее гибкий;</w:t>
+      </w:r>
+    </w:p>
+    <w:p>
+      <w:pPr>
+        <w:pStyle w:val="ListBullet"/>
+        <w:spacing w:after="60"/>
+      </w:pPr>
+      <w:r>
+        <w:t>состав населения по переписи — в регионах с разной культурой потребления разные корзины (например, свинина и алкоголь);</w:t>
+      </w:r>
+    </w:p>
+    <w:p>
+      <w:pPr>
+        <w:pStyle w:val="ListBullet"/>
+        <w:spacing w:after="60"/>
+      </w:pPr>
+      <w:r>
+        <w:t>тарифы ЖКХ — издержки магазинов и складов (холодильники — это электричество);</w:t>
+      </w:r>
+    </w:p>
+    <w:p>
+      <w:pPr>
+        <w:pStyle w:val="ListBullet"/>
+        <w:spacing w:after="60"/>
+      </w:pPr>
+      <w:r>
+        <w:t>туризм — приезжие увеличивают спрос на еду, включая привозную;</w:t>
+      </w:r>
+    </w:p>
+    <w:p>
+      <w:pPr>
+        <w:pStyle w:val="ListBullet"/>
+        <w:spacing w:after="60"/>
+      </w:pPr>
+      <w:r>
+        <w:t>погода — заморозки и засухи бьют по урожаю и ценам.</w:t>
+      </w:r>
+    </w:p>
+    <w:p>
+      <w:pPr>
+        <w:spacing w:after="120"/>
+      </w:pPr>
+      <w:r>
+        <w:rPr>
+          <w:b w:val="0"/>
+          <w:i w:val="0"/>
+        </w:rPr>
+        <w:t>Отдельно про погоду. Это особенно ценный слой: цены не влияют на погоду, поэтому погодные шоки — «чистый» внешний толчок. Если волна от погодного шока у соседа докатывается до региона, это сильный аргумент, что канал передачи реальный, товарный.</w:t>
       </w:r>
     </w:p>
     <w:p>
@@ -411,20 +591,58 @@
         <w:pStyle w:val="Heading2"/>
       </w:pPr>
       <w:r>
-        <w:t>1.3. Модельная рамка</w:t>
+        <w:t>1.3. Как слои складываются в модель</w:t>
       </w:r>
     </w:p>
     <w:p>
       <w:pPr>
         <w:spacing w:after="120"/>
-        <w:ind w:firstLine="0"/>
       </w:pPr>
       <w:r>
         <w:rPr>
           <w:b w:val="0"/>
           <w:i w:val="0"/>
         </w:rPr>
-        <w:t>Слои собираются в панельную регрессию по субъектам и месяцам с фиксированными эффектами регионов и времени: продовольственная инфляция региона объясняется её собственными лагами, транспортированным импульсом соседей на лагах 1–6 месяцев, средовыми контролями и взаимодействиями. Фиксированные эффекты времени поглощают общероссийские макрошоки (курс, ключевая ставка, федеральные решения), фиксированные эффекты регионов — постоянные региональные особенности; тем самым конструкция модели напрямую реализует требование гипотезы H4. Стандартные ошибки кластеризуются по регионам. Такая спецификация — пространственно-лаговая панель — является стандартом пространственной эконометрики и при этом полностью объяснима: каждый её элемент имеет прозрачную содержательную интерпретацию.</w:t>
+        <w:t>Мы объясняем продовольственную инфляцию региона в конкретном месяце тремя группами причин:</w:t>
+      </w:r>
+    </w:p>
+    <w:p>
+      <w:pPr>
+        <w:pStyle w:val="ListBullet"/>
+        <w:spacing w:after="60"/>
+      </w:pPr>
+      <w:r>
+        <w:t>его собственной инфляцией в прошлые месяцы;</w:t>
+      </w:r>
+    </w:p>
+    <w:p>
+      <w:pPr>
+        <w:pStyle w:val="ListBullet"/>
+        <w:spacing w:after="60"/>
+      </w:pPr>
+      <w:r>
+        <w:t>входящим импульсом от связанных регионов с задержкой от 1 до 6 месяцев;</w:t>
+      </w:r>
+    </w:p>
+    <w:p>
+      <w:pPr>
+        <w:pStyle w:val="ListBullet"/>
+        <w:spacing w:after="60"/>
+      </w:pPr>
+      <w:r>
+        <w:t>характеристиками среды и их сочетанием с входящим импульсом.</w:t>
+      </w:r>
+    </w:p>
+    <w:p>
+      <w:pPr>
+        <w:spacing w:after="120"/>
+      </w:pPr>
+      <w:r>
+        <w:rPr>
+          <w:b w:val="0"/>
+          <w:i w:val="0"/>
+        </w:rPr>
+        <w:t>Важная деталь конструкции. Мы отдельно вычитаем всё общероссийское (события, которые бьют по всем сразу: курс, ставка, федеральные решения) и всё постоянное региональное (север дороже юга всегда). Это делается стандартным приёмом — фиксированными эффектами. Так гипотеза H4 выполняется самой конструкцией модели: то, что остаётся, — именно межрегиональная передача, а не общий фон.</w:t>
       </w:r>
     </w:p>
     <w:p>
@@ -437,7 +655,7 @@
         <w:pStyle w:val="Heading1"/>
       </w:pPr>
       <w:r>
-        <w:t>2. Собранные данные</w:t>
+        <w:t>2. Какие данные мы собрали</w:t>
       </w:r>
     </w:p>
     <w:p>
@@ -445,7 +663,7 @@
         <w:pStyle w:val="Heading2"/>
       </w:pPr>
       <w:r>
-        <w:t>2.1. Принципы сбора</w:t>
+        <w:t>2.1. Правила, по которым идёт сбор</w:t>
       </w:r>
     </w:p>
     <w:p>
@@ -454,7 +672,7 @@
         <w:spacing w:after="60"/>
       </w:pPr>
       <w:r>
-        <w:t>Единый формат: каждый ряд приводится к виду «регион / период / значение».</w:t>
+        <w:t>Каждый ряд приводится к одному виду: регион / месяц / значение.</w:t>
       </w:r>
     </w:p>
     <w:p>
@@ -463,7 +681,7 @@
         <w:spacing w:after="60"/>
       </w:pPr>
       <w:r>
-        <w:t>Региональная гармонизация: 104 региональных наименования Росстата сведены к 85 субъектам; экономические районы, исторические округа и частичные territории исключены по явным правилам (файл соответствий хранится в проекте).</w:t>
+        <w:t>Названия регионов выверены: из 104 наименований Росстата оставлены 85 субъектов, дубли и исторические территории убраны по явным правилам.</w:t>
       </w:r>
     </w:p>
     <w:p>
@@ -472,7 +690,7 @@
         <w:spacing w:after="60"/>
       </w:pPr>
       <w:r>
-        <w:t>Паспортизация: для каждого фактора фиксируются источник, частота, период, единицы, ожидаемый знак и статус допуска в расчёты.</w:t>
+        <w:t>У каждого набора есть паспорт: источник, период, единицы, для чего используется.</w:t>
       </w:r>
     </w:p>
     <w:p>
@@ -481,7 +699,7 @@
         <w:spacing w:after="60"/>
       </w:pPr>
       <w:r>
-        <w:t>Воспроизводимость: каждый набор скачивается скриптом, журналируется манифестом и версионируется в репозитории GitHub; любой набор можно перекачать одной командой.</w:t>
+        <w:t>Всё скачивается скриптами и хранится в репозитории GitHub — любой набор можно перекачать и перепроверить одной командой.</w:t>
       </w:r>
     </w:p>
     <w:p>
@@ -489,20 +707,19 @@
         <w:pStyle w:val="Heading2"/>
       </w:pPr>
       <w:r>
-        <w:t>2.2. Цель и тело: ценовые ряды</w:t>
+        <w:t>2.2. Цены (цель и тело индекса)</w:t>
       </w:r>
     </w:p>
     <w:p>
       <w:pPr>
         <w:spacing w:after="120"/>
-        <w:ind w:firstLine="0"/>
       </w:pPr>
       <w:r>
         <w:rPr>
           <w:b w:val="0"/>
           <w:i w:val="0"/>
         </w:rPr>
-        <w:t>Источник — показатель Росстата (ЕМИСС/Fedstat) 31074 «Индексы потребительских цен на товары и услуги», метрика «к предыдущему месяцу». Покрытие: 2002-01 — 2026-06, все 85 субъектов.</w:t>
+        <w:t>Источник — Росстат, показатель 31074 «Индексы потребительских цен», изменение к предыдущему месяцу. Скачано за 2002–2026 годы по всем регионам.</w:t>
       </w:r>
     </w:p>
     <w:tbl>
@@ -520,7 +737,7 @@
       <w:tr>
         <w:tc>
           <w:tcPr>
-            <w:tcW w:type="dxa" w:w="2551"/>
+            <w:tcW w:type="dxa" w:w="1984"/>
           </w:tcPr>
           <w:p>
             <w:r>
@@ -528,13 +745,13 @@
                 <w:b/>
                 <w:sz w:val="20"/>
               </w:rPr>
-              <w:t>Набор</w:t>
+              <w:t>Что</w:t>
             </w:r>
           </w:p>
         </w:tc>
         <w:tc>
           <w:tcPr>
-            <w:tcW w:type="dxa" w:w="4252"/>
+            <w:tcW w:type="dxa" w:w="3969"/>
           </w:tcPr>
           <w:p>
             <w:r>
@@ -548,7 +765,7 @@
         </w:tc>
         <w:tc>
           <w:tcPr>
-            <w:tcW w:type="dxa" w:w="2835"/>
+            <w:tcW w:type="dxa" w:w="3685"/>
           </w:tcPr>
           <w:p>
             <w:r>
@@ -556,7 +773,7 @@
                 <w:b/>
                 <w:sz w:val="20"/>
               </w:rPr>
-              <w:t>Использование</w:t>
+              <w:t>Для чего</w:t>
             </w:r>
           </w:p>
         </w:tc>
@@ -564,40 +781,56 @@
       <w:tr>
         <w:tc>
           <w:tcPr>
-            <w:tcW w:type="dxa" w:w="2551"/>
+            <w:tcW w:type="dxa" w:w="1984"/>
           </w:tcPr>
           <w:p>
             <w:r>
               <w:rPr>
                 <w:sz w:val="20"/>
               </w:rPr>
-              <w:t>Целевые ряды (D01–D04)</w:t>
+              <w:t>Целевые ряды</w:t>
             </w:r>
           </w:p>
         </w:tc>
         <w:tc>
           <w:tcPr>
-            <w:tcW w:type="dxa" w:w="4252"/>
+            <w:tcW w:type="dxa" w:w="3969"/>
           </w:tcPr>
           <w:p>
             <w:r>
               <w:rPr>
                 <w:sz w:val="20"/>
               </w:rPr>
-              <w:t>ИПЦ: общий, продовольственный, непродовольственный, услуги</w:t>
+              <w:t>ИПЦ продовольственный (главный),</w:t>
+            </w:r>
+          </w:p>
+          <w:p>
+            <w:r>
+              <w:rPr>
+                <w:sz w:val="20"/>
+              </w:rPr>
+              <w:t>общий, непродовольственный, услуги</w:t>
             </w:r>
           </w:p>
         </w:tc>
         <w:tc>
           <w:tcPr>
-            <w:tcW w:type="dxa" w:w="2835"/>
+            <w:tcW w:type="dxa" w:w="3685"/>
           </w:tcPr>
           <w:p>
             <w:r>
               <w:rPr>
                 <w:sz w:val="20"/>
               </w:rPr>
-              <w:t>Продовольственный — зависимая переменная; остальные — контроль и сравнение</w:t>
+              <w:t>Продовольственный — то, что мы объясняем.</w:t>
+            </w:r>
+          </w:p>
+          <w:p>
+            <w:r>
+              <w:rPr>
+                <w:sz w:val="20"/>
+              </w:rPr>
+              <w:t>Остальные — для сравнения</w:t>
             </w:r>
           </w:p>
         </w:tc>
@@ -605,40 +838,80 @@
       <w:tr>
         <w:tc>
           <w:tcPr>
-            <w:tcW w:type="dxa" w:w="2551"/>
+            <w:tcW w:type="dxa" w:w="1984"/>
           </w:tcPr>
           <w:p>
             <w:r>
               <w:rPr>
                 <w:sz w:val="20"/>
               </w:rPr>
-              <w:t>Группы тела (D05–D08)</w:t>
+              <w:t>Товарные группы</w:t>
             </w:r>
           </w:p>
         </w:tc>
         <w:tc>
           <w:tcPr>
-            <w:tcW w:type="dxa" w:w="4252"/>
+            <w:tcW w:type="dxa" w:w="3969"/>
           </w:tcPr>
           <w:p>
             <w:r>
               <w:rPr>
                 <w:sz w:val="20"/>
               </w:rPr>
-              <w:t>Продовольствие без алкоголя; без овощей и фруктов; необязательного пользования; непродовольственные группы; бензин, дизель, моторное топливо; пассажирский, ж/д, авиатранспорт</w:t>
+              <w:t>продукты без алкоголя,</w:t>
+            </w:r>
+          </w:p>
+          <w:p>
+            <w:r>
+              <w:rPr>
+                <w:sz w:val="20"/>
+              </w:rPr>
+              <w:t>без овощей и фруктов,</w:t>
+            </w:r>
+          </w:p>
+          <w:p>
+            <w:r>
+              <w:rPr>
+                <w:sz w:val="20"/>
+              </w:rPr>
+              <w:t>«необязательные» товары,</w:t>
+            </w:r>
+          </w:p>
+          <w:p>
+            <w:r>
+              <w:rPr>
+                <w:sz w:val="20"/>
+              </w:rPr>
+              <w:t>бензин, дизель,</w:t>
+            </w:r>
+          </w:p>
+          <w:p>
+            <w:r>
+              <w:rPr>
+                <w:sz w:val="20"/>
+              </w:rPr>
+              <w:t>пассажирский, ж/д, авиатранспорт</w:t>
             </w:r>
           </w:p>
         </w:tc>
         <w:tc>
           <w:tcPr>
-            <w:tcW w:type="dxa" w:w="2835"/>
+            <w:tcW w:type="dxa" w:w="3685"/>
           </w:tcPr>
           <w:p>
             <w:r>
               <w:rPr>
                 <w:sz w:val="20"/>
               </w:rPr>
-              <w:t>Кандидаты тела индекса; топливо и тарифы — издержковый канал</w:t>
+              <w:t>Кандидаты в тело индекса.</w:t>
+            </w:r>
+          </w:p>
+          <w:p>
+            <w:r>
+              <w:rPr>
+                <w:sz w:val="20"/>
+              </w:rPr>
+              <w:t>Топливо — издержки перевозки</w:t>
             </w:r>
           </w:p>
         </w:tc>
@@ -646,40 +919,56 @@
       <w:tr>
         <w:tc>
           <w:tcPr>
-            <w:tcW w:type="dxa" w:w="2551"/>
+            <w:tcW w:type="dxa" w:w="1984"/>
           </w:tcPr>
           <w:p>
             <w:r>
               <w:rPr>
                 <w:sz w:val="20"/>
               </w:rPr>
-              <w:t>Товарные ряды (диф-тест H3)</w:t>
+              <w:t>Отдельные товары</w:t>
             </w:r>
           </w:p>
         </w:tc>
         <w:tc>
           <w:tcPr>
-            <w:tcW w:type="dxa" w:w="4252"/>
+            <w:tcW w:type="dxa" w:w="3969"/>
           </w:tcPr>
           <w:p>
             <w:r>
               <w:rPr>
                 <w:sz w:val="20"/>
               </w:rPr>
-              <w:t>Свинина, говядина, баранина, мясо птицы, алкогольные напитки, водка</w:t>
+              <w:t>свинина, говядина, баранина,</w:t>
+            </w:r>
+          </w:p>
+          <w:p>
+            <w:r>
+              <w:rPr>
+                <w:sz w:val="20"/>
+              </w:rPr>
+              <w:t>мясо птицы, алкоголь, водка</w:t>
             </w:r>
           </w:p>
         </w:tc>
         <w:tc>
           <w:tcPr>
-            <w:tcW w:type="dxa" w:w="2835"/>
+            <w:tcW w:type="dxa" w:w="3685"/>
           </w:tcPr>
           <w:p>
             <w:r>
               <w:rPr>
                 <w:sz w:val="20"/>
               </w:rPr>
-              <w:t>Дифференциальная проверка товарного канала: передача по товарам с разной структурой потребления</w:t>
+              <w:t>Проверка H3: сравнение передачи</w:t>
+            </w:r>
+          </w:p>
+          <w:p>
+            <w:r>
+              <w:rPr>
+                <w:sz w:val="20"/>
+              </w:rPr>
+              <w:t>по товарам с разной корзиной</w:t>
             </w:r>
           </w:p>
         </w:tc>
@@ -687,40 +976,40 @@
       <w:tr>
         <w:tc>
           <w:tcPr>
-            <w:tcW w:type="dxa" w:w="2551"/>
+            <w:tcW w:type="dxa" w:w="1984"/>
           </w:tcPr>
           <w:p>
             <w:r>
               <w:rPr>
                 <w:sz w:val="20"/>
               </w:rPr>
-              <w:t>Тарифы ЖКХ (D25)</w:t>
+              <w:t>Тарифы ЖКХ</w:t>
             </w:r>
           </w:p>
         </w:tc>
         <w:tc>
           <w:tcPr>
-            <w:tcW w:type="dxa" w:w="4252"/>
+            <w:tcW w:type="dxa" w:w="3969"/>
           </w:tcPr>
           <w:p>
             <w:r>
               <w:rPr>
                 <w:sz w:val="20"/>
               </w:rPr>
-              <w:t>Услуги организаций ЖКХ, 2008–2026</w:t>
+              <w:t>услуги ЖКХ, 2008–2026</w:t>
             </w:r>
           </w:p>
         </w:tc>
         <w:tc>
           <w:tcPr>
-            <w:tcW w:type="dxa" w:w="2835"/>
+            <w:tcW w:type="dxa" w:w="3685"/>
           </w:tcPr>
           <w:p>
             <w:r>
               <w:rPr>
                 <w:sz w:val="20"/>
               </w:rPr>
-              <w:t>Издержковый контроль; квазиэкзогенная административная индексация</w:t>
+              <w:t>Издержки торговли и хранения</w:t>
             </w:r>
           </w:p>
         </w:tc>
@@ -732,7 +1021,7 @@
         <w:pStyle w:val="Heading2"/>
       </w:pPr>
       <w:r>
-        <w:t>2.3. Транспортный слой</w:t>
+        <w:t>2.3. Связи между регионами (транспорт)</w:t>
       </w:r>
     </w:p>
     <w:tbl>
@@ -750,7 +1039,7 @@
       <w:tr>
         <w:tc>
           <w:tcPr>
-            <w:tcW w:type="dxa" w:w="2268"/>
+            <w:tcW w:type="dxa" w:w="1984"/>
           </w:tcPr>
           <w:p>
             <w:r>
@@ -758,7 +1047,7 @@
                 <w:b/>
                 <w:sz w:val="20"/>
               </w:rPr>
-              <w:t>Набор</w:t>
+              <w:t>Что</w:t>
             </w:r>
           </w:p>
         </w:tc>
@@ -772,13 +1061,13 @@
                 <w:b/>
                 <w:sz w:val="20"/>
               </w:rPr>
-              <w:t>Источник и объём</w:t>
+              <w:t>Откуда и сколько</w:t>
             </w:r>
           </w:p>
         </w:tc>
         <w:tc>
           <w:tcPr>
-            <w:tcW w:type="dxa" w:w="3402"/>
+            <w:tcW w:type="dxa" w:w="3685"/>
           </w:tcPr>
           <w:p>
             <w:r>
@@ -786,7 +1075,7 @@
                 <w:b/>
                 <w:sz w:val="20"/>
               </w:rPr>
-              <w:t>Использование</w:t>
+              <w:t>Для чего</w:t>
             </w:r>
           </w:p>
         </w:tc>
@@ -794,7 +1083,7 @@
       <w:tr>
         <w:tc>
           <w:tcPr>
-            <w:tcW w:type="dxa" w:w="2268"/>
+            <w:tcW w:type="dxa" w:w="1984"/>
           </w:tcPr>
           <w:p>
             <w:r>
@@ -814,13 +1103,21 @@
               <w:rPr>
                 <w:sz w:val="20"/>
               </w:rPr>
-              <w:t>85 субъектов: федеральный округ, столица, координаты</w:t>
+              <w:t>85 субъектов: округ, столица,</w:t>
+            </w:r>
+          </w:p>
+          <w:p>
+            <w:r>
+              <w:rPr>
+                <w:sz w:val="20"/>
+              </w:rPr>
+              <w:t>координаты</w:t>
             </w:r>
           </w:p>
         </w:tc>
         <w:tc>
           <w:tcPr>
-            <w:tcW w:type="dxa" w:w="3402"/>
+            <w:tcW w:type="dxa" w:w="3685"/>
           </w:tcPr>
           <w:p>
             <w:r>
@@ -835,7 +1132,7 @@
       <w:tr>
         <w:tc>
           <w:tcPr>
-            <w:tcW w:type="dxa" w:w="2268"/>
+            <w:tcW w:type="dxa" w:w="1984"/>
           </w:tcPr>
           <w:p>
             <w:r>
@@ -855,20 +1152,28 @@
               <w:rPr>
                 <w:sz w:val="20"/>
               </w:rPr>
-              <w:t>geoBoundaries ADM1, 83 полигона</w:t>
+              <w:t>geoBoundaries, 83 полигона</w:t>
             </w:r>
           </w:p>
         </w:tc>
         <w:tc>
           <w:tcPr>
-            <w:tcW w:type="dxa" w:w="3402"/>
+            <w:tcW w:type="dxa" w:w="3685"/>
           </w:tcPr>
           <w:p>
             <w:r>
               <w:rPr>
                 <w:sz w:val="20"/>
               </w:rPr>
-              <w:t>Геометрия для соседства и привязки точечных данных</w:t>
+              <w:t>Геометрия для соседства</w:t>
+            </w:r>
+          </w:p>
+          <w:p>
+            <w:r>
+              <w:rPr>
+                <w:sz w:val="20"/>
+              </w:rPr>
+              <w:t>и привязки точек</w:t>
             </w:r>
           </w:p>
         </w:tc>
@@ -876,14 +1181,14 @@
       <w:tr>
         <w:tc>
           <w:tcPr>
-            <w:tcW w:type="dxa" w:w="2268"/>
+            <w:tcW w:type="dxa" w:w="1984"/>
           </w:tcPr>
           <w:p>
             <w:r>
               <w:rPr>
                 <w:sz w:val="20"/>
               </w:rPr>
-              <w:t>Матрица соседства</w:t>
+              <w:t>Соседство</w:t>
             </w:r>
           </w:p>
         </w:tc>
@@ -896,20 +1201,28 @@
               <w:rPr>
                 <w:sz w:val="20"/>
               </w:rPr>
-              <w:t>190 пар с общей границей (вычислена из полигонов)</w:t>
+              <w:t>190 пар с общей границей</w:t>
+            </w:r>
+          </w:p>
+          <w:p>
+            <w:r>
+              <w:rPr>
+                <w:sz w:val="20"/>
+              </w:rPr>
+              <w:t>(вычислено из полигонов)</w:t>
             </w:r>
           </w:p>
         </w:tc>
         <w:tc>
           <w:tcPr>
-            <w:tcW w:type="dxa" w:w="3402"/>
+            <w:tcW w:type="dxa" w:w="3685"/>
           </w:tcPr>
           <w:p>
             <w:r>
               <w:rPr>
                 <w:sz w:val="20"/>
               </w:rPr>
-              <w:t>Главный канал H1; основа взвешенных вариантов</w:t>
+              <w:t>Главный канал (гипотеза H1)</w:t>
             </w:r>
           </w:p>
         </w:tc>
@@ -917,7 +1230,7 @@
       <w:tr>
         <w:tc>
           <w:tcPr>
-            <w:tcW w:type="dxa" w:w="2268"/>
+            <w:tcW w:type="dxa" w:w="1984"/>
           </w:tcPr>
           <w:p>
             <w:r>
@@ -937,20 +1250,20 @@
               <w:rPr>
                 <w:sz w:val="20"/>
               </w:rPr>
-              <w:t>Хаверсин между столицами, все пары</w:t>
+              <w:t>между столицами, все пары</w:t>
             </w:r>
           </w:p>
         </w:tc>
         <w:tc>
           <w:tcPr>
-            <w:tcW w:type="dxa" w:w="3402"/>
+            <w:tcW w:type="dxa" w:w="3685"/>
           </w:tcPr>
           <w:p>
             <w:r>
               <w:rPr>
                 <w:sz w:val="20"/>
               </w:rPr>
-              <w:t>Канал затухания с дистанцией</w:t>
+              <w:t>Канал «чем ближе — тем сильнее»</w:t>
             </w:r>
           </w:p>
         </w:tc>
@@ -958,7 +1271,7 @@
       <w:tr>
         <w:tc>
           <w:tcPr>
-            <w:tcW w:type="dxa" w:w="2268"/>
+            <w:tcW w:type="dxa" w:w="1984"/>
           </w:tcPr>
           <w:p>
             <w:r>
@@ -978,20 +1291,28 @@
               <w:rPr>
                 <w:sz w:val="20"/>
               </w:rPr>
-              <w:t>OpenStreetMap: 6 168 станций (без метро), привязаны к субъектам</w:t>
+              <w:t>OpenStreetMap: 6 168 станций</w:t>
+            </w:r>
+          </w:p>
+          <w:p>
+            <w:r>
+              <w:rPr>
+                <w:sz w:val="20"/>
+              </w:rPr>
+              <w:t>(метро исключено)</w:t>
             </w:r>
           </w:p>
         </w:tc>
         <w:tc>
           <w:tcPr>
-            <w:tcW w:type="dxa" w:w="3402"/>
+            <w:tcW w:type="dxa" w:w="3685"/>
           </w:tcPr>
           <w:p>
             <w:r>
               <w:rPr>
                 <w:sz w:val="20"/>
               </w:rPr>
-              <w:t>Узловые веса: соседи с крупными узлами передают сильнее</w:t>
+              <w:t>Вес соседа с крупным узлом выше</w:t>
             </w:r>
           </w:p>
         </w:tc>
@@ -999,7 +1320,7 @@
       <w:tr>
         <w:tc>
           <w:tcPr>
-            <w:tcW w:type="dxa" w:w="2268"/>
+            <w:tcW w:type="dxa" w:w="1984"/>
           </w:tcPr>
           <w:p>
             <w:r>
@@ -1019,20 +1340,28 @@
               <w:rPr>
                 <w:sz w:val="20"/>
               </w:rPr>
-              <w:t>OpenStreetMap, магистральные линии (сборка завершается)</w:t>
+              <w:t>OpenStreetMap: 153 791 участок путей,</w:t>
+            </w:r>
+          </w:p>
+          <w:p>
+            <w:r>
+              <w:rPr>
+                <w:sz w:val="20"/>
+              </w:rPr>
+              <w:t>128 пар регионов с прямой магистралью</w:t>
             </w:r>
           </w:p>
         </w:tc>
         <w:tc>
           <w:tcPr>
-            <w:tcW w:type="dxa" w:w="3402"/>
+            <w:tcW w:type="dxa" w:w="3685"/>
           </w:tcPr>
           <w:p>
             <w:r>
               <w:rPr>
                 <w:sz w:val="20"/>
               </w:rPr>
-              <w:t>Матрица «прямая магистраль между регионами» (H2, транспортная связанность)</w:t>
+              <w:t>Канал транспортной связанности (H2)</w:t>
             </w:r>
           </w:p>
         </w:tc>
@@ -1040,7 +1369,7 @@
       <w:tr>
         <w:tc>
           <w:tcPr>
-            <w:tcW w:type="dxa" w:w="2268"/>
+            <w:tcW w:type="dxa" w:w="1984"/>
           </w:tcPr>
           <w:p>
             <w:r>
@@ -1060,20 +1389,28 @@
               <w:rPr>
                 <w:sz w:val="20"/>
               </w:rPr>
-              <w:t>OpenStreetMap: федеральные трассы с полосностью (в сборке)</w:t>
+              <w:t>OpenStreetMap: федеральные трассы</w:t>
+            </w:r>
+          </w:p>
+          <w:p>
+            <w:r>
+              <w:rPr>
+                <w:sz w:val="20"/>
+              </w:rPr>
+              <w:t>с числом полос (досчитывается)</w:t>
             </w:r>
           </w:p>
         </w:tc>
         <w:tc>
           <w:tcPr>
-            <w:tcW w:type="dxa" w:w="3402"/>
+            <w:tcW w:type="dxa" w:w="3685"/>
           </w:tcPr>
           <w:p>
             <w:r>
               <w:rPr>
                 <w:sz w:val="20"/>
               </w:rPr>
-              <w:t>Пропускная способность границ; платные участки — надбавка коридора</w:t>
+              <w:t>Пропускная способность границы</w:t>
             </w:r>
           </w:p>
         </w:tc>
@@ -1085,7 +1422,7 @@
         <w:pStyle w:val="Heading2"/>
       </w:pPr>
       <w:r>
-        <w:t>2.4. Средовый слой</w:t>
+        <w:t>2.4. Характеристики регионов (среда)</w:t>
       </w:r>
     </w:p>
     <w:tbl>
@@ -1103,7 +1440,7 @@
       <w:tr>
         <w:tc>
           <w:tcPr>
-            <w:tcW w:type="dxa" w:w="2551"/>
+            <w:tcW w:type="dxa" w:w="1984"/>
           </w:tcPr>
           <w:p>
             <w:r>
@@ -1111,7 +1448,21 @@
                 <w:b/>
                 <w:sz w:val="20"/>
               </w:rPr>
-              <w:t>Набор</w:t>
+              <w:t>Что</w:t>
+            </w:r>
+          </w:p>
+        </w:tc>
+        <w:tc>
+          <w:tcPr>
+            <w:tcW w:type="dxa" w:w="3969"/>
+          </w:tcPr>
+          <w:p>
+            <w:r>
+              <w:rPr>
+                <w:b/>
+                <w:sz w:val="20"/>
+              </w:rPr>
+              <w:t>Откуда, за какие годы</w:t>
             </w:r>
           </w:p>
         </w:tc>
@@ -1125,21 +1476,7 @@
                 <w:b/>
                 <w:sz w:val="20"/>
               </w:rPr>
-              <w:t>Источник, период</w:t>
-            </w:r>
-          </w:p>
-        </w:tc>
-        <w:tc>
-          <w:tcPr>
-            <w:tcW w:type="dxa" w:w="3402"/>
-          </w:tcPr>
-          <w:p>
-            <w:r>
-              <w:rPr>
-                <w:b/>
-                <w:sz w:val="20"/>
-              </w:rPr>
-              <w:t>Использование</w:t>
+              <w:t>Для чего</w:t>
             </w:r>
           </w:p>
         </w:tc>
@@ -1147,14 +1484,35 @@
       <w:tr>
         <w:tc>
           <w:tcPr>
-            <w:tcW w:type="dxa" w:w="2551"/>
+            <w:tcW w:type="dxa" w:w="1984"/>
           </w:tcPr>
           <w:p>
             <w:r>
               <w:rPr>
                 <w:sz w:val="20"/>
               </w:rPr>
-              <w:t>Продукция сельского хозяйства</w:t>
+              <w:t>Сельское хозяйство</w:t>
+            </w:r>
+          </w:p>
+        </w:tc>
+        <w:tc>
+          <w:tcPr>
+            <w:tcW w:type="dxa" w:w="3969"/>
+          </w:tcPr>
+          <w:p>
+            <w:r>
+              <w:rPr>
+                <w:sz w:val="20"/>
+              </w:rPr>
+              <w:t>ЕМИСС, 1991–2024,</w:t>
+            </w:r>
+          </w:p>
+          <w:p>
+            <w:r>
+              <w:rPr>
+                <w:sz w:val="20"/>
+              </w:rPr>
+              <w:t>все категории хозяйств</w:t>
             </w:r>
           </w:p>
         </w:tc>
@@ -1167,20 +1525,7 @@
               <w:rPr>
                 <w:sz w:val="20"/>
               </w:rPr>
-              <w:t>ЕМИСС 43337, 1991–2024, все категории хозяйств</w:t>
-            </w:r>
-          </w:p>
-        </w:tc>
-        <w:tc>
-          <w:tcPr>
-            <w:tcW w:type="dxa" w:w="3402"/>
-          </w:tcPr>
-          <w:p>
-            <w:r>
-              <w:rPr>
-                <w:sz w:val="20"/>
-              </w:rPr>
-              <w:t>Пищевая база региона; взаимодействие с входящим импульсом</w:t>
+              <w:t>Своя пищевая база региона</w:t>
             </w:r>
           </w:p>
         </w:tc>
@@ -1188,14 +1533,35 @@
       <w:tr>
         <w:tc>
           <w:tcPr>
-            <w:tcW w:type="dxa" w:w="2551"/>
+            <w:tcW w:type="dxa" w:w="1984"/>
           </w:tcPr>
           <w:p>
             <w:r>
               <w:rPr>
                 <w:sz w:val="20"/>
               </w:rPr>
-              <w:t>Индекс производства пищевых продуктов</w:t>
+              <w:t>Производство продуктов</w:t>
+            </w:r>
+          </w:p>
+        </w:tc>
+        <w:tc>
+          <w:tcPr>
+            <w:tcW w:type="dxa" w:w="3969"/>
+          </w:tcPr>
+          <w:p>
+            <w:r>
+              <w:rPr>
+                <w:sz w:val="20"/>
+              </w:rPr>
+              <w:t>ЕМИСС, 2015–2024,</w:t>
+            </w:r>
+          </w:p>
+          <w:p>
+            <w:r>
+              <w:rPr>
+                <w:sz w:val="20"/>
+              </w:rPr>
+              <w:t>индекс по отрасли «пищевые продукты»</w:t>
             </w:r>
           </w:p>
         </w:tc>
@@ -1208,20 +1574,7 @@
               <w:rPr>
                 <w:sz w:val="20"/>
               </w:rPr>
-              <w:t>ЕМИСС 57807 (ОКВЭД2), 2015–2024</w:t>
-            </w:r>
-          </w:p>
-        </w:tc>
-        <w:tc>
-          <w:tcPr>
-            <w:tcW w:type="dxa" w:w="3402"/>
-          </w:tcPr>
-          <w:p>
-            <w:r>
-              <w:rPr>
-                <w:sz w:val="20"/>
-              </w:rPr>
-              <w:t>Динамика пищевой промышленности</w:t>
+              <w:t>Динамика пищепрома</w:t>
             </w:r>
           </w:p>
         </w:tc>
@@ -1229,33 +1582,41 @@
       <w:tr>
         <w:tc>
           <w:tcPr>
-            <w:tcW w:type="dxa" w:w="2551"/>
+            <w:tcW w:type="dxa" w:w="1984"/>
           </w:tcPr>
           <w:p>
             <w:r>
               <w:rPr>
                 <w:sz w:val="20"/>
               </w:rPr>
-              <w:t>Среднедушевые доходы</w:t>
+              <w:t>Доходы и зарплаты</w:t>
+            </w:r>
+          </w:p>
+        </w:tc>
+        <w:tc>
+          <w:tcPr>
+            <w:tcW w:type="dxa" w:w="3969"/>
+          </w:tcPr>
+          <w:p>
+            <w:r>
+              <w:rPr>
+                <w:sz w:val="20"/>
+              </w:rPr>
+              <w:t>ЕМИСС: доходы 1995–2026,</w:t>
+            </w:r>
+          </w:p>
+          <w:p>
+            <w:r>
+              <w:rPr>
+                <w:sz w:val="20"/>
+              </w:rPr>
+              <w:t>зарплата 2015–2023</w:t>
             </w:r>
           </w:p>
         </w:tc>
         <w:tc>
           <w:tcPr>
             <w:tcW w:type="dxa" w:w="3685"/>
-          </w:tcPr>
-          <w:p>
-            <w:r>
-              <w:rPr>
-                <w:sz w:val="20"/>
-              </w:rPr>
-              <w:t>ЕМИСС 57039, кварталы, 1995–2026</w:t>
-            </w:r>
-          </w:p>
-        </w:tc>
-        <w:tc>
-          <w:tcPr>
-            <w:tcW w:type="dxa" w:w="3402"/>
           </w:tcPr>
           <w:p>
             <w:r>
@@ -1270,14 +1631,27 @@
       <w:tr>
         <w:tc>
           <w:tcPr>
-            <w:tcW w:type="dxa" w:w="2551"/>
+            <w:tcW w:type="dxa" w:w="1984"/>
           </w:tcPr>
           <w:p>
             <w:r>
               <w:rPr>
                 <w:sz w:val="20"/>
               </w:rPr>
-              <w:t>Заработная плата</w:t>
+              <w:t>Безработица</w:t>
+            </w:r>
+          </w:p>
+        </w:tc>
+        <w:tc>
+          <w:tcPr>
+            <w:tcW w:type="dxa" w:w="3969"/>
+          </w:tcPr>
+          <w:p>
+            <w:r>
+              <w:rPr>
+                <w:sz w:val="20"/>
+              </w:rPr>
+              <w:t>ЕМИСС, кварталы, 2000–2025</w:t>
             </w:r>
           </w:p>
         </w:tc>
@@ -1290,20 +1664,7 @@
               <w:rPr>
                 <w:sz w:val="20"/>
               </w:rPr>
-              <w:t>ЕМИСС 56791, 2015–2023</w:t>
-            </w:r>
-          </w:p>
-        </w:tc>
-        <w:tc>
-          <w:tcPr>
-            <w:tcW w:type="dxa" w:w="3402"/>
-          </w:tcPr>
-          <w:p>
-            <w:r>
-              <w:rPr>
-                <w:sz w:val="20"/>
-              </w:rPr>
-              <w:t>Дополнение к доходам</w:t>
+              <w:t>Состояние рынка труда</w:t>
             </w:r>
           </w:p>
         </w:tc>
@@ -1311,14 +1672,35 @@
       <w:tr>
         <w:tc>
           <w:tcPr>
-            <w:tcW w:type="dxa" w:w="2551"/>
+            <w:tcW w:type="dxa" w:w="1984"/>
           </w:tcPr>
           <w:p>
             <w:r>
               <w:rPr>
                 <w:sz w:val="20"/>
               </w:rPr>
-              <w:t>Безработица (МОТ)</w:t>
+              <w:t>Население и возраст</w:t>
+            </w:r>
+          </w:p>
+        </w:tc>
+        <w:tc>
+          <w:tcPr>
+            <w:tcW w:type="dxa" w:w="3969"/>
+          </w:tcPr>
+          <w:p>
+            <w:r>
+              <w:rPr>
+                <w:sz w:val="20"/>
+              </w:rPr>
+              <w:t>ЕМИСС: численность 1990–2025,</w:t>
+            </w:r>
+          </w:p>
+          <w:p>
+            <w:r>
+              <w:rPr>
+                <w:sz w:val="20"/>
+              </w:rPr>
+              <w:t>мужчины и женщины по возрастам</w:t>
             </w:r>
           </w:p>
         </w:tc>
@@ -1331,20 +1713,15 @@
               <w:rPr>
                 <w:sz w:val="20"/>
               </w:rPr>
-              <w:t>ЕМИСС 43062, кварталы, 2000–2025</w:t>
+              <w:t>Нормировки «на душу»;</w:t>
             </w:r>
           </w:p>
-        </w:tc>
-        <w:tc>
-          <w:tcPr>
-            <w:tcW w:type="dxa" w:w="3402"/>
-          </w:tcPr>
           <w:p>
             <w:r>
               <w:rPr>
                 <w:sz w:val="20"/>
               </w:rPr>
-              <w:t>Состояние спроса и рынка труда</w:t>
+              <w:t>доля старших — гибкость спроса</w:t>
             </w:r>
           </w:p>
         </w:tc>
@@ -1352,115 +1729,33 @@
       <w:tr>
         <w:tc>
           <w:tcPr>
-            <w:tcW w:type="dxa" w:w="2551"/>
+            <w:tcW w:type="dxa" w:w="1984"/>
           </w:tcPr>
           <w:p>
             <w:r>
               <w:rPr>
                 <w:sz w:val="20"/>
               </w:rPr>
-              <w:t>Численность населения</w:t>
+              <w:t>Рождаемость, смертность</w:t>
+            </w:r>
+          </w:p>
+        </w:tc>
+        <w:tc>
+          <w:tcPr>
+            <w:tcW w:type="dxa" w:w="3969"/>
+          </w:tcPr>
+          <w:p>
+            <w:r>
+              <w:rPr>
+                <w:sz w:val="20"/>
+              </w:rPr>
+              <w:t>ЕМИСС, 1990–2023</w:t>
             </w:r>
           </w:p>
         </w:tc>
         <w:tc>
           <w:tcPr>
             <w:tcW w:type="dxa" w:w="3685"/>
-          </w:tcPr>
-          <w:p>
-            <w:r>
-              <w:rPr>
-                <w:sz w:val="20"/>
-              </w:rPr>
-              <w:t>ЕМИСС 31557, 1990–2025</w:t>
-            </w:r>
-          </w:p>
-        </w:tc>
-        <w:tc>
-          <w:tcPr>
-            <w:tcW w:type="dxa" w:w="3402"/>
-          </w:tcPr>
-          <w:p>
-            <w:r>
-              <w:rPr>
-                <w:sz w:val="20"/>
-              </w:rPr>
-              <w:t>Нормировки «на душу»; веса</w:t>
-            </w:r>
-          </w:p>
-        </w:tc>
-      </w:tr>
-      <w:tr>
-        <w:tc>
-          <w:tcPr>
-            <w:tcW w:type="dxa" w:w="2551"/>
-          </w:tcPr>
-          <w:p>
-            <w:r>
-              <w:rPr>
-                <w:sz w:val="20"/>
-              </w:rPr>
-              <w:t>Половозрастная структура</w:t>
-            </w:r>
-          </w:p>
-        </w:tc>
-        <w:tc>
-          <w:tcPr>
-            <w:tcW w:type="dxa" w:w="3685"/>
-          </w:tcPr>
-          <w:p>
-            <w:r>
-              <w:rPr>
-                <w:sz w:val="20"/>
-              </w:rPr>
-              <w:t>ЕМИСС 31548/33459, 1990–2025</w:t>
-            </w:r>
-          </w:p>
-        </w:tc>
-        <w:tc>
-          <w:tcPr>
-            <w:tcW w:type="dxa" w:w="3402"/>
-          </w:tcPr>
-          <w:p>
-            <w:r>
-              <w:rPr>
-                <w:sz w:val="20"/>
-              </w:rPr>
-              <w:t>Доля старших возрастов — модератор эластичности спроса</w:t>
-            </w:r>
-          </w:p>
-        </w:tc>
-      </w:tr>
-      <w:tr>
-        <w:tc>
-          <w:tcPr>
-            <w:tcW w:type="dxa" w:w="2551"/>
-          </w:tcPr>
-          <w:p>
-            <w:r>
-              <w:rPr>
-                <w:sz w:val="20"/>
-              </w:rPr>
-              <w:t>Рождаемость и смертность</w:t>
-            </w:r>
-          </w:p>
-        </w:tc>
-        <w:tc>
-          <w:tcPr>
-            <w:tcW w:type="dxa" w:w="3685"/>
-          </w:tcPr>
-          <w:p>
-            <w:r>
-              <w:rPr>
-                <w:sz w:val="20"/>
-              </w:rPr>
-              <w:t>ЕМИСС 31606/31617, 1990–2023</w:t>
-            </w:r>
-          </w:p>
-        </w:tc>
-        <w:tc>
-          <w:tcPr>
-            <w:tcW w:type="dxa" w:w="3402"/>
           </w:tcPr>
           <w:p>
             <w:r>
@@ -1475,14 +1770,35 @@
       <w:tr>
         <w:tc>
           <w:tcPr>
-            <w:tcW w:type="dxa" w:w="2551"/>
+            <w:tcW w:type="dxa" w:w="1984"/>
           </w:tcPr>
           <w:p>
             <w:r>
               <w:rPr>
                 <w:sz w:val="20"/>
               </w:rPr>
-              <w:t>Этнокультурная структура</w:t>
+              <w:t>Перепись населения</w:t>
+            </w:r>
+          </w:p>
+        </w:tc>
+        <w:tc>
+          <w:tcPr>
+            <w:tcW w:type="dxa" w:w="3969"/>
+          </w:tcPr>
+          <w:p>
+            <w:r>
+              <w:rPr>
+                <w:sz w:val="20"/>
+              </w:rPr>
+              <w:t>ВПН-2020, том 5:</w:t>
+            </w:r>
+          </w:p>
+          <w:p>
+            <w:r>
+              <w:rPr>
+                <w:sz w:val="20"/>
+              </w:rPr>
+              <w:t>национальный состав 88 регионов</w:t>
             </w:r>
           </w:p>
         </w:tc>
@@ -1495,20 +1811,15 @@
               <w:rPr>
                 <w:sz w:val="20"/>
               </w:rPr>
-              <w:t>Перепись ВПН-2020, том 5: национальный состав 88 регионов</w:t>
+              <w:t>Различия продовольственной корзины</w:t>
             </w:r>
           </w:p>
-        </w:tc>
-        <w:tc>
-          <w:tcPr>
-            <w:tcW w:type="dxa" w:w="3402"/>
-          </w:tcPr>
           <w:p>
             <w:r>
               <w:rPr>
                 <w:sz w:val="20"/>
               </w:rPr>
-              <w:t>Структура потребления; дифференциальный тест H3 по товарам</w:t>
+              <w:t>для проверки H3</w:t>
             </w:r>
           </w:p>
         </w:tc>
@@ -1516,14 +1827,35 @@
       <w:tr>
         <w:tc>
           <w:tcPr>
-            <w:tcW w:type="dxa" w:w="2551"/>
+            <w:tcW w:type="dxa" w:w="1984"/>
           </w:tcPr>
           <w:p>
             <w:r>
               <w:rPr>
                 <w:sz w:val="20"/>
               </w:rPr>
-              <w:t>Туристическая инфраструктура</w:t>
+              <w:t>Туризм</w:t>
+            </w:r>
+          </w:p>
+        </w:tc>
+        <w:tc>
+          <w:tcPr>
+            <w:tcW w:type="dxa" w:w="3969"/>
+          </w:tcPr>
+          <w:p>
+            <w:r>
+              <w:rPr>
+                <w:sz w:val="20"/>
+              </w:rPr>
+              <w:t>OpenStreetMap: 14 754 отеля,</w:t>
+            </w:r>
+          </w:p>
+          <w:p>
+            <w:r>
+              <w:rPr>
+                <w:sz w:val="20"/>
+              </w:rPr>
+              <w:t>14 835 ресторанов</w:t>
             </w:r>
           </w:p>
         </w:tc>
@@ -1536,20 +1868,7 @@
               <w:rPr>
                 <w:sz w:val="20"/>
               </w:rPr>
-              <w:t>OpenStreetMap: 14 754 отеля, 14 835 ресторанов</w:t>
-            </w:r>
-          </w:p>
-        </w:tc>
-        <w:tc>
-          <w:tcPr>
-            <w:tcW w:type="dxa" w:w="3402"/>
-          </w:tcPr>
-          <w:p>
-            <w:r>
-              <w:rPr>
-                <w:sz w:val="20"/>
-              </w:rPr>
-              <w:t>Приезжий спрос как усилитель восприимчивости</w:t>
+              <w:t>Приезжий спрос</w:t>
             </w:r>
           </w:p>
         </w:tc>
@@ -1557,14 +1876,35 @@
       <w:tr>
         <w:tc>
           <w:tcPr>
-            <w:tcW w:type="dxa" w:w="2551"/>
+            <w:tcW w:type="dxa" w:w="1984"/>
           </w:tcPr>
           <w:p>
             <w:r>
               <w:rPr>
                 <w:sz w:val="20"/>
               </w:rPr>
-              <w:t>Валютный курс</w:t>
+              <w:t>Курс валют</w:t>
+            </w:r>
+          </w:p>
+        </w:tc>
+        <w:tc>
+          <w:tcPr>
+            <w:tcW w:type="dxa" w:w="3969"/>
+          </w:tcPr>
+          <w:p>
+            <w:r>
+              <w:rPr>
+                <w:sz w:val="20"/>
+              </w:rPr>
+              <w:t>Банк России: доллар и евро,</w:t>
+            </w:r>
+          </w:p>
+          <w:p>
+            <w:r>
+              <w:rPr>
+                <w:sz w:val="20"/>
+              </w:rPr>
+              <w:t>месячные средние, 2014–2026</w:t>
             </w:r>
           </w:p>
         </w:tc>
@@ -1577,20 +1917,7 @@
               <w:rPr>
                 <w:sz w:val="20"/>
               </w:rPr>
-              <w:t>Банк России, месячные средние USD/EUR, 2014–2026</w:t>
-            </w:r>
-          </w:p>
-        </w:tc>
-        <w:tc>
-          <w:tcPr>
-            <w:tcW w:type="dxa" w:w="3402"/>
-          </w:tcPr>
-          <w:p>
-            <w:r>
-              <w:rPr>
-                <w:sz w:val="20"/>
-              </w:rPr>
-              <w:t>Внешний шок; взаимодействия с импортозависимостью</w:t>
+              <w:t>Внешний шок</w:t>
             </w:r>
           </w:p>
         </w:tc>
@@ -1602,28 +1929,19 @@
         <w:pStyle w:val="Heading2"/>
       </w:pPr>
       <w:r>
-        <w:t>2.5. Климатический слой</w:t>
+        <w:t>2.5. Погода (климатический слой)</w:t>
       </w:r>
     </w:p>
     <w:p>
       <w:pPr>
         <w:spacing w:after="120"/>
-        <w:ind w:firstLine="0"/>
       </w:pPr>
       <w:r>
         <w:rPr>
           <w:b w:val="0"/>
           <w:i w:val="0"/>
         </w:rPr>
-        <w:t>Источник — глобальный архив месячной температуры NOAA GHCN-M v4 (контроль качества QCF): 939 российских станций, из них 865 привязаны к полигонам субъектов. Для каждого региона и месяца рассчитана аномалия температуры относительно климатической нормали 1991–2020 гг. этого региона и календарного месяца; ряд покрывает 2014-01 — 2026-06 по 82 субъектам. Планируемое использование двоякое: контроль локальных шоков предложения (заморозки, засухи) и — главное — источник экзогенной вариации: погодный шок в регионе-производителе не может быть вызван ценами, поэтому его распространение на соседние регионы служит квазипричинным свидетельством товарного канала передачи. Осадки планируется добавить из реанализа ERA5 (требуется регистрация).</w:t>
-      </w:r>
-    </w:p>
-    <w:p>
-      <w:pPr>
-        <w:pStyle w:val="Heading2"/>
-      </w:pPr>
-      <w:r>
-        <w:t>2.6. Инфраструктура сбора</w:t>
+        <w:t>Источник — мировой архив месячной температуры NOAA (GHCN-M). Что сделано:</w:t>
       </w:r>
     </w:p>
     <w:p>
@@ -1632,7 +1950,7 @@
         <w:spacing w:after="60"/>
       </w:pPr>
       <w:r>
-        <w:t>Чанковый загрузчик Fedstat: обходит ограничение формата .xls в 256 колонок (из-за которого полная история обрезалась) скачиванием по 13 лет со склейкой.</w:t>
+        <w:t>взяты 939 российских метеостанций, 865 из них привязаны к регионам;</w:t>
       </w:r>
     </w:p>
     <w:p>
@@ -1641,7 +1959,7 @@
         <w:spacing w:after="60"/>
       </w:pPr>
       <w:r>
-        <w:t>Универсальный загрузчик ЕМИСС: скачивает любой показатель по его номеру — автоматически распознаёт измерения (годы, периоды, регионы), выгружает Excel кусками и нормализует в единый формат.</w:t>
+        <w:t>для каждого региона и месяца посчитано отклонение температуры от нормы 1991–2020 годов именно этого региона и этого календарного месяца;</w:t>
       </w:r>
     </w:p>
     <w:p>
@@ -1650,7 +1968,39 @@
         <w:spacing w:after="60"/>
       </w:pPr>
       <w:r>
-        <w:t>Полосная выгрузка OpenStreetMap: карта России режется на долготные полосы с кэшированием на диск и автоматическим делением перегруженных полос.</w:t>
+        <w:t>получился ряд 2014–2026 по 82 регионам.</w:t>
+      </w:r>
+    </w:p>
+    <w:p>
+      <w:pPr>
+        <w:spacing w:after="120"/>
+      </w:pPr>
+      <w:r>
+        <w:rPr>
+          <w:b w:val="0"/>
+          <w:i w:val="0"/>
+        </w:rPr>
+        <w:t>Дальше планируем добавить осадки (архив ERA5, нужна бесплатная регистрация).</w:t>
+      </w:r>
+    </w:p>
+    <w:p>
+      <w:pPr>
+        <w:pStyle w:val="Heading2"/>
+      </w:pPr>
+      <w:r>
+        <w:t>2.6. Как устроено скачивание</w:t>
+      </w:r>
+    </w:p>
+    <w:p>
+      <w:pPr>
+        <w:spacing w:after="120"/>
+      </w:pPr>
+      <w:r>
+        <w:rPr>
+          <w:b w:val="0"/>
+          <w:i w:val="0"/>
+        </w:rPr>
+        <w:t>По пути пришлось решить несколько технических задач — о них стоит сказать, потому что они экономят месяцы ручной работы:</w:t>
       </w:r>
     </w:p>
     <w:p>
@@ -1659,7 +2009,34 @@
         <w:spacing w:after="60"/>
       </w:pPr>
       <w:r>
-        <w:t>Контроль качества: манифест каждой загрузки, сверка контрольных сумм (например, итог переписи 147 182 123 человека сошёлся с официальным).</w:t>
+        <w:t>у Росстата выгрузка в Excel обрезается на 256 колонках — из-за этого история «заканчивалась» в 2023 году; мы качаем по 13 лет за раз и склеиваем — теперь есть полные ряды до 2026 года;</w:t>
+      </w:r>
+    </w:p>
+    <w:p>
+      <w:pPr>
+        <w:pStyle w:val="ListBullet"/>
+        <w:spacing w:after="60"/>
+      </w:pPr>
+      <w:r>
+        <w:t>написан универсальный загрузчик ЕМИСС: любой показатель скачивается по его номеру одной командой;</w:t>
+      </w:r>
+    </w:p>
+    <w:p>
+      <w:pPr>
+        <w:pStyle w:val="ListBullet"/>
+        <w:spacing w:after="60"/>
+      </w:pPr>
+      <w:r>
+        <w:t>карты OpenStreetMap для всей страны качаются «полосами» по долготе с сохранением на диск — обрыв связи ничего не теряет;</w:t>
+      </w:r>
+    </w:p>
+    <w:p>
+      <w:pPr>
+        <w:pStyle w:val="ListBullet"/>
+        <w:spacing w:after="60"/>
+      </w:pPr>
+      <w:r>
+        <w:t>каждая загрузка проверяется: например, сумма по переписи сошлась с официальной численностью населения России до человека.</w:t>
       </w:r>
     </w:p>
     <w:p>
@@ -1667,20 +2044,52 @@
         <w:pStyle w:val="Heading2"/>
       </w:pPr>
       <w:r>
-        <w:t>2.7. Очередь сбора</w:t>
+        <w:t>2.7. Что ещё в очереди</w:t>
       </w:r>
     </w:p>
     <w:p>
       <w:pPr>
-        <w:spacing w:after="120"/>
-        <w:ind w:firstLine="0"/>
+        <w:pStyle w:val="ListBullet"/>
+        <w:spacing w:after="60"/>
       </w:pPr>
       <w:r>
-        <w:rPr>
-          <w:b w:val="0"/>
-          <w:i w:val="0"/>
-        </w:rPr>
-        <w:t>Остаются в работе: автодорожная матрица (полосность; сборка идёт), осадки ERA5, холодовые склады (разведка отраслевых источников), региональный индекс тревожности (проверка существования месячной панели), кадастровая стоимость промышленно-складских земель (фонд данных Росреестра).</w:t>
+        <w:t>автодорожная матрица с полосностью — досчитывается прямо сейчас;</w:t>
+      </w:r>
+    </w:p>
+    <w:p>
+      <w:pPr>
+        <w:pStyle w:val="ListBullet"/>
+        <w:spacing w:after="60"/>
+      </w:pPr>
+      <w:r>
+        <w:t>осадки ERA5 — после регистрации;</w:t>
+      </w:r>
+    </w:p>
+    <w:p>
+      <w:pPr>
+        <w:pStyle w:val="ListBullet"/>
+        <w:spacing w:after="60"/>
+      </w:pPr>
+      <w:r>
+        <w:t>холодильные склады — ищем открытый источник по отраслевым организациям;</w:t>
+      </w:r>
+    </w:p>
+    <w:p>
+      <w:pPr>
+        <w:pStyle w:val="ListBullet"/>
+        <w:spacing w:after="60"/>
+      </w:pPr>
+      <w:r>
+        <w:t>индекс тревожности регионов — проверяем, существует ли месячная панель;</w:t>
+      </w:r>
+    </w:p>
+    <w:p>
+      <w:pPr>
+        <w:pStyle w:val="ListBullet"/>
+        <w:spacing w:after="60"/>
+      </w:pPr>
+      <w:r>
+        <w:t>кадастровая стоимость промышленных и складских земель — фонд данных Росреестра.</w:t>
       </w:r>
     </w:p>
     <w:p>
@@ -1701,20 +2110,76 @@
         <w:pStyle w:val="Heading2"/>
       </w:pPr>
       <w:r>
-        <w:t>3.1. Назначение и состав</w:t>
+        <w:t>3.1. Что это такое</w:t>
       </w:r>
     </w:p>
     <w:p>
       <w:pPr>
         <w:spacing w:after="120"/>
-        <w:ind w:firstLine="0"/>
       </w:pPr>
       <w:r>
         <w:rPr>
           <w:b w:val="0"/>
           <w:i w:val="0"/>
         </w:rPr>
-        <w:t>Лаборатория индекса — специализированное программное обеспечение проекта, решающее три задачи: управляемый сбор данных, сборка и проверка вариантов индекса, воспроизводимость результатов. Состав: настольное приложение «Fedstat Research Workstation» (загрузка таблиц Росстата, карта регионов, объёмная «волновая» визуализация показателя над картой страны) и приложение «Лаборатория индекса» (каталог факторов, паспорт данных, конструктор рецептов индекса, автоподбор, интерактивная блок-схема исследовательского конвейера).</w:t>
+        <w:t>Лаборатория — это наша программная среда, в которой живёт весь проект. Она нужна для трёх вещей:</w:t>
+      </w:r>
+    </w:p>
+    <w:p>
+      <w:pPr>
+        <w:pStyle w:val="ListBullet"/>
+        <w:spacing w:after="60"/>
+      </w:pPr>
+      <w:r>
+        <w:t>порядок в данных: каталог факторов с паспортами, ничего не теряется;</w:t>
+      </w:r>
+    </w:p>
+    <w:p>
+      <w:pPr>
+        <w:pStyle w:val="ListBullet"/>
+        <w:spacing w:after="60"/>
+      </w:pPr>
+      <w:r>
+        <w:t>сборка индекса: рецепт можно собрать вручную или довериться автоподбору;</w:t>
+      </w:r>
+    </w:p>
+    <w:p>
+      <w:pPr>
+        <w:pStyle w:val="ListBullet"/>
+        <w:spacing w:after="60"/>
+      </w:pPr>
+      <w:r>
+        <w:t>воспроизводимость: каждый результат можно пересчитать заново одной командой.</w:t>
+      </w:r>
+    </w:p>
+    <w:p>
+      <w:pPr>
+        <w:spacing w:after="120"/>
+      </w:pPr>
+      <w:r>
+        <w:rPr>
+          <w:b w:val="0"/>
+          <w:i w:val="0"/>
+        </w:rPr>
+        <w:t>Лаборатория состоит из двух приложений:</w:t>
+      </w:r>
+    </w:p>
+    <w:p>
+      <w:pPr>
+        <w:pStyle w:val="ListBullet"/>
+        <w:spacing w:after="60"/>
+      </w:pPr>
+      <w:r>
+        <w:t>«Fedstat Research Workstation» — загрузка таблиц Росстата, карта регионов и объёмная «волновая» визуализация: показатель поднимается поверхностью над картой страны;</w:t>
+      </w:r>
+    </w:p>
+    <w:p>
+      <w:pPr>
+        <w:pStyle w:val="ListBullet"/>
+        <w:spacing w:after="60"/>
+      </w:pPr>
+      <w:r>
+        <w:t>«Лаборатория индекса» — каталог факторов, паспорт данных, конструктор рецептов и интерактивная блок-схема всего исследования.</w:t>
       </w:r>
     </w:p>
     <w:p>
@@ -1722,20 +2187,19 @@
         <w:pStyle w:val="Heading2"/>
       </w:pPr>
       <w:r>
-        <w:t>3.2. Исследовательский конвейер</w:t>
+        <w:t>3.2. Конвейер исследования</w:t>
       </w:r>
     </w:p>
     <w:p>
       <w:pPr>
         <w:spacing w:after="120"/>
-        <w:ind w:firstLine="0"/>
       </w:pPr>
       <w:r>
         <w:rPr>
           <w:b w:val="0"/>
           <w:i w:val="0"/>
         </w:rPr>
-        <w:t>Конвейер лаборатории фиксирует путь от сырых данных до научного результата и отображается на стартовом экране в виде интерактивной блок-схемы:</w:t>
+        <w:t>Путь от сырых данных до результата разбит на 11 шагов. Эта схема отображается на стартовом экране лаборатории, блоки можно двигать и раскрывать:</w:t>
       </w:r>
     </w:p>
     <w:tbl>
@@ -1752,7 +2216,7 @@
       <w:tr>
         <w:tc>
           <w:tcPr>
-            <w:tcW w:type="dxa" w:w="1701"/>
+            <w:tcW w:type="dxa" w:w="1984"/>
           </w:tcPr>
           <w:p>
             <w:r>
@@ -1760,13 +2224,13 @@
                 <w:b/>
                 <w:sz w:val="20"/>
               </w:rPr>
-              <w:t>Блок</w:t>
+              <w:t>Шаг</w:t>
             </w:r>
           </w:p>
         </w:tc>
         <w:tc>
           <w:tcPr>
-            <w:tcW w:type="dxa" w:w="7937"/>
+            <w:tcW w:type="dxa" w:w="7654"/>
           </w:tcPr>
           <w:p>
             <w:r>
@@ -1774,7 +2238,7 @@
                 <w:b/>
                 <w:sz w:val="20"/>
               </w:rPr>
-              <w:t>Вход → Операция → Выход</w:t>
+              <w:t>Что происходит</w:t>
             </w:r>
           </w:p>
         </w:tc>
@@ -1782,27 +2246,27 @@
       <w:tr>
         <w:tc>
           <w:tcPr>
-            <w:tcW w:type="dxa" w:w="1701"/>
+            <w:tcW w:type="dxa" w:w="1984"/>
           </w:tcPr>
           <w:p>
             <w:r>
               <w:rPr>
                 <w:sz w:val="20"/>
               </w:rPr>
-              <w:t>Данные</w:t>
+              <w:t>1. Данные</w:t>
             </w:r>
           </w:p>
         </w:tc>
         <w:tc>
           <w:tcPr>
-            <w:tcW w:type="dxa" w:w="7937"/>
+            <w:tcW w:type="dxa" w:w="7654"/>
           </w:tcPr>
           <w:p>
             <w:r>
               <w:rPr>
                 <w:sz w:val="20"/>
               </w:rPr>
-              <w:t>Выгрузки источников → приведение к формату «регион/период/значение» → каталог факторов</w:t>
+              <w:t>выгрузки источников приводятся к виду «регион / месяц / значение»</w:t>
             </w:r>
           </w:p>
         </w:tc>
@@ -1810,27 +2274,27 @@
       <w:tr>
         <w:tc>
           <w:tcPr>
-            <w:tcW w:type="dxa" w:w="1701"/>
+            <w:tcW w:type="dxa" w:w="1984"/>
           </w:tcPr>
           <w:p>
             <w:r>
               <w:rPr>
                 <w:sz w:val="20"/>
               </w:rPr>
-              <w:t>Цель</w:t>
+              <w:t>2. Цель</w:t>
             </w:r>
           </w:p>
         </w:tc>
         <w:tc>
           <w:tcPr>
-            <w:tcW w:type="dxa" w:w="7937"/>
+            <w:tcW w:type="dxa" w:w="7654"/>
           </w:tcPr>
           <w:p>
             <w:r>
               <w:rPr>
                 <w:sz w:val="20"/>
               </w:rPr>
-              <w:t>Выбор целевой инфляции → задание горизонта → целевая панель</w:t>
+              <w:t>выбираем, какую инфляцию объясняем и на каком горизонте</w:t>
             </w:r>
           </w:p>
         </w:tc>
@@ -1838,27 +2302,27 @@
       <w:tr>
         <w:tc>
           <w:tcPr>
-            <w:tcW w:type="dxa" w:w="1701"/>
+            <w:tcW w:type="dxa" w:w="1984"/>
           </w:tcPr>
           <w:p>
             <w:r>
               <w:rPr>
                 <w:sz w:val="20"/>
               </w:rPr>
-              <w:t>Шоки</w:t>
+              <w:t>3. Шоки</w:t>
             </w:r>
           </w:p>
         </w:tc>
         <w:tc>
           <w:tcPr>
-            <w:tcW w:type="dxa" w:w="7937"/>
+            <w:tcW w:type="dxa" w:w="7654"/>
           </w:tcPr>
           <w:p>
             <w:r>
               <w:rPr>
                 <w:sz w:val="20"/>
               </w:rPr>
-              <w:t>Сырые ряды → преобразования (изменение, отклонение, стандартизация) → сопоставимые импульсы</w:t>
+              <w:t>превращаем ряды в сопоставимые импульсы (изменения, отклонения)</w:t>
             </w:r>
           </w:p>
         </w:tc>
@@ -1866,27 +2330,27 @@
       <w:tr>
         <w:tc>
           <w:tcPr>
-            <w:tcW w:type="dxa" w:w="1701"/>
+            <w:tcW w:type="dxa" w:w="1984"/>
           </w:tcPr>
           <w:p>
             <w:r>
               <w:rPr>
                 <w:sz w:val="20"/>
               </w:rPr>
-              <w:t>Тело</w:t>
+              <w:t>4. Тело</w:t>
             </w:r>
           </w:p>
         </w:tc>
         <w:tc>
           <w:tcPr>
-            <w:tcW w:type="dxa" w:w="7937"/>
+            <w:tcW w:type="dxa" w:w="7654"/>
           </w:tcPr>
           <w:p>
             <w:r>
               <w:rPr>
                 <w:sz w:val="20"/>
               </w:rPr>
-              <w:t>Товарные и ценовые ряды → отбор кандидатов → элементы тела с лагами</w:t>
+              <w:t>отбираем товарные и ценовые ряды-кандидаты</w:t>
             </w:r>
           </w:p>
         </w:tc>
@@ -1894,27 +2358,27 @@
       <w:tr>
         <w:tc>
           <w:tcPr>
-            <w:tcW w:type="dxa" w:w="1701"/>
+            <w:tcW w:type="dxa" w:w="1984"/>
           </w:tcPr>
           <w:p>
             <w:r>
               <w:rPr>
                 <w:sz w:val="20"/>
               </w:rPr>
-              <w:t>Среда</w:t>
+              <w:t>5. Среда</w:t>
             </w:r>
           </w:p>
         </w:tc>
         <w:tc>
           <w:tcPr>
-            <w:tcW w:type="dxa" w:w="7937"/>
+            <w:tcW w:type="dxa" w:w="7654"/>
           </w:tcPr>
           <w:p>
             <w:r>
               <w:rPr>
                 <w:sz w:val="20"/>
               </w:rPr>
-              <w:t>Региональные характеристики → проверка усиления/гашения → модераторы</w:t>
+              <w:t>проверяем, какие характеристики региона усиливают или гасят волну</w:t>
             </w:r>
           </w:p>
         </w:tc>
@@ -1922,27 +2386,27 @@
       <w:tr>
         <w:tc>
           <w:tcPr>
-            <w:tcW w:type="dxa" w:w="1701"/>
+            <w:tcW w:type="dxa" w:w="1984"/>
           </w:tcPr>
           <w:p>
             <w:r>
               <w:rPr>
                 <w:sz w:val="20"/>
               </w:rPr>
-              <w:t>Транспорт</w:t>
+              <w:t>6. Транспорт</w:t>
             </w:r>
           </w:p>
         </w:tc>
         <w:tc>
           <w:tcPr>
-            <w:tcW w:type="dxa" w:w="7937"/>
+            <w:tcW w:type="dxa" w:w="7654"/>
           </w:tcPr>
           <w:p>
             <w:r>
               <w:rPr>
                 <w:sz w:val="20"/>
               </w:rPr>
-              <w:t>География и инфраструктура → матрицы связей W → транспортированный импульс</w:t>
+              <w:t>строим матрицы связей и входящий импульс от соседей</w:t>
             </w:r>
           </w:p>
         </w:tc>
@@ -1950,27 +2414,27 @@
       <w:tr>
         <w:tc>
           <w:tcPr>
-            <w:tcW w:type="dxa" w:w="1701"/>
+            <w:tcW w:type="dxa" w:w="1984"/>
           </w:tcPr>
           <w:p>
             <w:r>
               <w:rPr>
                 <w:sz w:val="20"/>
               </w:rPr>
-              <w:t>Лаги</w:t>
+              <w:t>7. Лаги</w:t>
             </w:r>
           </w:p>
         </w:tc>
         <w:tc>
           <w:tcPr>
-            <w:tcW w:type="dxa" w:w="7937"/>
+            <w:tcW w:type="dxa" w:w="7654"/>
           </w:tcPr>
           <w:p>
             <w:r>
               <w:rPr>
                 <w:sz w:val="20"/>
               </w:rPr>
-              <w:t>Кандидаты → проверка задержек 0–6 мес. → временной профиль передачи</w:t>
+              <w:t>ищем задержку, с которой волна докатывается (1–6 месяцев)</w:t>
             </w:r>
           </w:p>
         </w:tc>
@@ -1978,27 +2442,27 @@
       <w:tr>
         <w:tc>
           <w:tcPr>
-            <w:tcW w:type="dxa" w:w="1701"/>
+            <w:tcW w:type="dxa" w:w="1984"/>
           </w:tcPr>
           <w:p>
             <w:r>
               <w:rPr>
                 <w:sz w:val="20"/>
               </w:rPr>
-              <w:t>Оценка</w:t>
+              <w:t>8. Оценка</w:t>
             </w:r>
           </w:p>
         </w:tc>
         <w:tc>
           <w:tcPr>
-            <w:tcW w:type="dxa" w:w="7937"/>
+            <w:tcW w:type="dxa" w:w="7654"/>
           </w:tcPr>
           <w:p>
             <w:r>
               <w:rPr>
                 <w:sz w:val="20"/>
               </w:rPr>
-              <w:t>Панельная регрессия с фиксированными эффектами → коэффициенты и значимость</w:t>
+              <w:t>панельная регрессия: коэффициенты и их значимость</w:t>
             </w:r>
           </w:p>
         </w:tc>
@@ -2006,27 +2470,27 @@
       <w:tr>
         <w:tc>
           <w:tcPr>
-            <w:tcW w:type="dxa" w:w="1701"/>
+            <w:tcW w:type="dxa" w:w="1984"/>
           </w:tcPr>
           <w:p>
             <w:r>
               <w:rPr>
                 <w:sz w:val="20"/>
               </w:rPr>
-              <w:t>Рецепт</w:t>
+              <w:t>9. Рецепт</w:t>
             </w:r>
           </w:p>
         </w:tc>
         <w:tc>
           <w:tcPr>
-            <w:tcW w:type="dxa" w:w="7937"/>
+            <w:tcW w:type="dxa" w:w="7654"/>
           </w:tcPr>
           <w:p>
             <w:r>
               <w:rPr>
                 <w:sz w:val="20"/>
               </w:rPr>
-              <w:t>Отобранные элементы → единый редактируемый рецепт индекса</w:t>
+              <w:t>собираем удачные элементы в единый редактируемый рецепт индекса</w:t>
             </w:r>
           </w:p>
         </w:tc>
@@ -2034,27 +2498,27 @@
       <w:tr>
         <w:tc>
           <w:tcPr>
-            <w:tcW w:type="dxa" w:w="1701"/>
+            <w:tcW w:type="dxa" w:w="1984"/>
           </w:tcPr>
           <w:p>
             <w:r>
               <w:rPr>
                 <w:sz w:val="20"/>
               </w:rPr>
-              <w:t>Проверка</w:t>
+              <w:t>10. Проверка</w:t>
             </w:r>
           </w:p>
         </w:tc>
         <w:tc>
           <w:tcPr>
-            <w:tcW w:type="dxa" w:w="7937"/>
+            <w:tcW w:type="dxa" w:w="7654"/>
           </w:tcPr>
           <w:p>
             <w:r>
               <w:rPr>
                 <w:sz w:val="20"/>
               </w:rPr>
-              <w:t>Подпериоды, скользящие окна, плацебо-сети → паспорт устойчивости</w:t>
+              <w:t>испытываем рецепт на прочность: другие периоды, ложные сети</w:t>
             </w:r>
           </w:p>
         </w:tc>
@@ -2062,27 +2526,27 @@
       <w:tr>
         <w:tc>
           <w:tcPr>
-            <w:tcW w:type="dxa" w:w="1701"/>
+            <w:tcW w:type="dxa" w:w="1984"/>
           </w:tcPr>
           <w:p>
             <w:r>
               <w:rPr>
                 <w:sz w:val="20"/>
               </w:rPr>
-              <w:t>Результат</w:t>
+              <w:t>11. Результат</w:t>
             </w:r>
           </w:p>
         </w:tc>
         <w:tc>
           <w:tcPr>
-            <w:tcW w:type="dxa" w:w="7937"/>
+            <w:tcW w:type="dxa" w:w="7654"/>
           </w:tcPr>
           <w:p>
             <w:r>
               <w:rPr>
                 <w:sz w:val="20"/>
               </w:rPr>
-              <w:t>Карты, таблицы, классификация регионов → материал научной работы</w:t>
+              <w:t>карты, таблицы, классификация регионов — материал работы</w:t>
             </w:r>
           </w:p>
         </w:tc>
@@ -2094,20 +2558,19 @@
         <w:pStyle w:val="Heading2"/>
       </w:pPr>
       <w:r>
-        <w:t>3.3. Аналитический контур</w:t>
+        <w:t>3.3. Расчётные скрипты</w:t>
       </w:r>
     </w:p>
     <w:p>
       <w:pPr>
         <w:spacing w:after="120"/>
-        <w:ind w:firstLine="0"/>
       </w:pPr>
       <w:r>
         <w:rPr>
           <w:b w:val="0"/>
           <w:i w:val="0"/>
         </w:rPr>
-        <w:t>Расчётная часть реализована набором подписанных скриптов (папка analysis), каждый из которых решает одну задачу и может быть перезапущен независимо:</w:t>
+        <w:t>Вся аналитика написана отдельными скриптами — по одному на задачу. Основные группы:</w:t>
       </w:r>
     </w:p>
     <w:p>
@@ -2116,7 +2579,7 @@
         <w:spacing w:after="60"/>
       </w:pPr>
       <w:r>
-        <w:t>загрузчики: Fedstat (чанковый), универсальный ЕМИСС, курс Банка России, климат NOAA, вокзалы/линии/дороги/туризм OpenStreetMap, таблицы переписи;</w:t>
+        <w:t>загрузчики: Росстат, ЕМИСС, Банк России, погода NOAA, карты OpenStreetMap, таблицы переписи;</w:t>
       </w:r>
     </w:p>
     <w:p>
@@ -2125,7 +2588,7 @@
         <w:spacing w:after="60"/>
       </w:pPr>
       <w:r>
-        <w:t>геообработка: матрица соседства из полигонов, привязка точек к субъектам, гармонизация региональных наименований;</w:t>
+        <w:t>геообработка: построение соседства из полигонов, привязка станций, вокзалов и ресторанов к регионам;</w:t>
       </w:r>
     </w:p>
     <w:p>
@@ -2134,7 +2597,7 @@
         <w:spacing w:after="60"/>
       </w:pPr>
       <w:r>
-        <w:t>дистилляция: приведение скачанных показателей к субъектным панелям (включая официальные возрастные агрегаты и фильтры категорий);</w:t>
+        <w:t>приведение данных: фильтрация до уровня субъектов, официальные возрастные агрегаты, доли из переписи;</w:t>
       </w:r>
     </w:p>
     <w:p>
@@ -2143,7 +2606,7 @@
         <w:spacing w:after="60"/>
       </w:pPr>
       <w:r>
-        <w:t>модели: базовая пространственно-лаговая панель, сравнение матриц связей, климатическая спецификация, средовые взаимодействия, товарный дифференциальный тест, валидация (подпериоды, окна, плацебо);</w:t>
+        <w:t>модели: базовая модель распространения, сравнение карт связей, погодная спецификация, средовые взаимодействия, товарный тест, проверки устойчивости;</w:t>
       </w:r>
     </w:p>
     <w:p>
@@ -2152,7 +2615,7 @@
         <w:spacing w:after="60"/>
       </w:pPr>
       <w:r>
-        <w:t>визуализация: карты регионов-источников и получателей, график устойчивости.</w:t>
+        <w:t>картинки: карты регионов-источников и получателей, графики устойчивости.</w:t>
       </w:r>
     </w:p>
     <w:p>
@@ -2160,20 +2623,19 @@
         <w:pStyle w:val="Heading2"/>
       </w:pPr>
       <w:r>
-        <w:t>3.4. Хранение и воспроизводимость</w:t>
+        <w:t>3.4. Хранение</w:t>
       </w:r>
     </w:p>
     <w:p>
       <w:pPr>
         <w:spacing w:after="120"/>
-        <w:ind w:firstLine="0"/>
       </w:pPr>
       <w:r>
         <w:rPr>
           <w:b w:val="0"/>
           <w:i w:val="0"/>
         </w:rPr>
-        <w:t>Проект ведётся в git-репозитории (GitHub, приватный): код, документация, утверждённая формулировка задачи, компактные данные и результаты версионируются; тяжёлые сырые выгрузки исключены и восстанавливаются скриптами. Дорожные карты проекта (вехи M0–M8 и очередь данных D01–D26) ведутся в самом репозитории и обновляются по мере работы — текущее состояние всегда зафиксировано письменно.</w:t>
+        <w:t>Проект живёт в приватном репозитории на GitHub. Там версионируются код, документы, утверждённая формулировка задачи, компактные данные и результаты. Тяжёлые сырые выгрузки в репозиторий не кладутся — они восстанавливаются скриптами. Дорожные карты проекта (вехи и очередь данных) ведутся тут же и обновляются по ходу работы.</w:t>
       </w:r>
     </w:p>
     <w:p>
@@ -2187,14 +2649,49 @@
     <w:p>
       <w:pPr>
         <w:spacing w:after="120"/>
-        <w:ind w:firstLine="0"/>
       </w:pPr>
       <w:r>
         <w:rPr>
           <w:b w:val="0"/>
           <w:i w:val="0"/>
         </w:rPr>
-        <w:t>Созданы все три опоры исследования: концепция индекса, реализующая утверждённую задачу; корпус данных, покрывающий цель, тело, транспорт, среду и климат (17 наборов собраны полностью, 5 — частично, 4 — в очереди); лаборатория, обеспечивающая воспроизводимость. Ближайшие шаги: завершение автодорожной матрицы и матрицы железнодорожных магистралей, пополнение климатического слоя осадками, оценка полной линейки моделей на всех каналах связи и подготовка текста исследовательской работы.</w:t>
+        <w:t>Три опоры исследования готовы: концепция, данные, лаборатория. Счёт по данным: 17 наборов собраны полностью, 5 — частично, 4 — в очереди. Ближайшие шаги:</w:t>
+      </w:r>
+    </w:p>
+    <w:p>
+      <w:pPr>
+        <w:pStyle w:val="ListBullet"/>
+        <w:spacing w:after="60"/>
+      </w:pPr>
+      <w:r>
+        <w:t>закончить автодорожную матрицу и включить её в сравнение каналов;</w:t>
+      </w:r>
+    </w:p>
+    <w:p>
+      <w:pPr>
+        <w:pStyle w:val="ListBullet"/>
+        <w:spacing w:after="60"/>
+      </w:pPr>
+      <w:r>
+        <w:t>добавить осадки в погодный слой;</w:t>
+      </w:r>
+    </w:p>
+    <w:p>
+      <w:pPr>
+        <w:pStyle w:val="ListBullet"/>
+        <w:spacing w:after="60"/>
+      </w:pPr>
+      <w:r>
+        <w:t>прогнать полную линейку моделей на всех каналах связи;</w:t>
+      </w:r>
+    </w:p>
+    <w:p>
+      <w:pPr>
+        <w:pStyle w:val="ListBullet"/>
+        <w:spacing w:after="60"/>
+      </w:pPr>
+      <w:r>
+        <w:t>начать собирать текст исследовательской работы.</w:t>
       </w:r>
     </w:p>
     <w:sectPr>

</xml_diff>